<commit_message>
fix: relatorio final com texto limpo do v3 — sem quebras de PDF
</commit_message>
<xml_diff>
--- a/webapp/Relatorio_Final_Grupo11.docx
+++ b/webapp/Relatorio_Final_Grupo11.docx
@@ -189,7 +189,6 @@
         <w:t>RIBEIRO, Diego Beran; VENTURINI, Narci Edson. Plataforma georreferenciada de programas de pós-graduação no Brasil. Relatório Técnico-Científico. Bacharelado em Ciência de Dados e Tecnologia da Informação — Universidade Virtual do Estado de São Paulo. Tutor: Carla Maria da Silva Diaz. Polo Campinas, 2026.</w:t>
       </w:r>
     </w:p>
-    <w:p/>
     <w:p/>
     <w:tbl>
       <w:tblPr>
@@ -253,7 +252,7 @@
         <w:rPr>
           <w:sz w:val="24"/>
         </w:rPr>
-        <w:t>Este relatório final apresenta o desenvolvimento da plataforma web georreferenciada "Pós-Graduação Brasil", construída como Projeto Integrador do curso de Bacharelado em Ciência de Dados e Tecnologia da Informação da UNIVESP. O objetivo foi integrar dados de 576 IES e 7.488 cursos de pós-graduação da CAPES e do MEC em uma interface de mapa interativo com filtros, busca por endereço com geocodificação, dashboard estatístico e exportação CSV. A solução foi implementada em Django 5, Leaflet.js, Bootstrap 5.3 e Chart.js 4.4, com deploy na plataforma Railway. A metodologia seguiu o Design Thinking (ouvir, criar, prototipar), com validação junto à comunidade de potenciais pós-graduandos. Os resultados demonstram que a plataforma atende ao problema identificado: a fragmentação das informações sobre pós-graduação em diferentes portais oficiais, oferecendo uma ferramenta unificada de consulta geográfica e estatística.</w:t>
+        <w:t>Este relatório final apresenta o desenvolvimento da plataforma web georreferenciada "Pós-Graduação Brasil", construída como Projeto Integrador do curso de Bacharelado em Ciência de Dados e Tecnologia da Informação da UNIVESP. O objetivo foi integrar dados de 576 IES e 7.488 cursos de pós-graduação da CAPES e do MEC em uma interface de mapa interativo com filtros, busca por endereço com geocodificação, dashboard estatístico e exportação CSV. A solução foi implementada em Django 5, Leaflet.js, Bootstrap 5.3 e Chart.js 4.4, com deploy na plataforma Railway. A metodologia seguiu o Design Thinking (ouvir, criar, prototipar). Os resultados demonstram que a plataforma atende ao problema identificado: a fragmentação das informações sobre pós-graduação em diferentes portais oficiais.</w:t>
       </w:r>
     </w:p>
     <w:p>
@@ -283,7 +282,7 @@
         <w:rPr>
           <w:sz w:val="24"/>
         </w:rPr>
-        <w:t>Figura 1 — Tela de busca por informações sobre especialização no e-MEC</w:t>
+        <w:t>Figura 1 — Tela de busca por especialização no e-MEC</w:t>
       </w:r>
     </w:p>
     <w:p>
@@ -291,7 +290,7 @@
         <w:rPr>
           <w:sz w:val="24"/>
         </w:rPr>
-        <w:t>Figura 2 — GEOCAPES — Sistema de informações georreferenciadas da CAPES</w:t>
+        <w:t>Figura 2 — GEOCAPES — Sistema de informações georreferenciadas</w:t>
       </w:r>
     </w:p>
     <w:p>
@@ -299,7 +298,7 @@
         <w:rPr>
           <w:sz w:val="24"/>
         </w:rPr>
-        <w:t>Figura 3 — Tela do GitHub com projeto PI-UNIVESP-GRUPO-11-1S2026</w:t>
+        <w:t>Figura 3 — Tela do GitHub com projeto PI-UNIVESP-GRUPO-11</w:t>
       </w:r>
     </w:p>
     <w:p>
@@ -307,7 +306,7 @@
         <w:rPr>
           <w:sz w:val="24"/>
         </w:rPr>
-        <w:t>Figura 4 — MER MySQL dos dados considerados no projeto</w:t>
+        <w:t>Figura 4 — MER MySQL dos dados do projeto</w:t>
       </w:r>
     </w:p>
     <w:p>
@@ -315,7 +314,7 @@
         <w:rPr>
           <w:sz w:val="24"/>
         </w:rPr>
-        <w:t>Figura 5 — Mapa interativo com funcionalidade de busca por endereço/CEP</w:t>
+        <w:t>Figura 5 — Mapa interativo com busca por endereço/CEP</w:t>
       </w:r>
     </w:p>
     <w:p>
@@ -323,7 +322,7 @@
         <w:rPr>
           <w:sz w:val="24"/>
         </w:rPr>
-        <w:t>Figura 6 — Dashboard estatístico com gráficos e nota média CAPES</w:t>
+        <w:t>Figura 6 — Dashboard estatístico com nota média CAPES</w:t>
       </w:r>
     </w:p>
     <w:p>
@@ -415,7 +414,7 @@
         <w:rPr>
           <w:sz w:val="24"/>
         </w:rPr>
-        <w:t xml:space="preserve">   2.4 Aplicação das disciplinas estudadas no Projeto Integrador</w:t>
+        <w:t xml:space="preserve">   2.4 Aplicação das disciplinas estudadas</w:t>
       </w:r>
     </w:p>
     <w:p>
@@ -483,9 +482,10 @@
       </w:pPr>
       <w:r>
         <w:rPr>
+          <w:rFonts w:ascii="Times New Roman" w:hAnsi="Times New Roman"/>
           <w:sz w:val="24"/>
         </w:rPr>
-        <w:t>1 INTRODUÇÃO</w:t>
+        <w:t>De acordo com as informações divulgadas pela revista Carta Capital (CARTA CAPITAL, 2025) a partir de pesquisa realizada pela Conquer Business School (CONQUER BUSINESS SCHOOL,</w:t>
       </w:r>
     </w:p>
     <w:p>
@@ -496,9 +496,10 @@
       </w:pPr>
       <w:r>
         <w:rPr>
+          <w:rFonts w:ascii="Times New Roman" w:hAnsi="Times New Roman"/>
           <w:sz w:val="24"/>
         </w:rPr>
-        <w:t>De acordo com as informações divulgadas pela revista Carta Capital (CARTA CAPITAL, 2025) a</w:t>
+        <w:t>2025) com base na análise de comportamento digital de usuários da internet, o volume de buscas por cursos de pós-graduação aumentou 22% nos últimos 12 meses no Brasil. Neste período foram</w:t>
       </w:r>
     </w:p>
     <w:p>
@@ -509,9 +510,10 @@
       </w:pPr>
       <w:r>
         <w:rPr>
+          <w:rFonts w:ascii="Times New Roman" w:hAnsi="Times New Roman"/>
           <w:sz w:val="24"/>
         </w:rPr>
-        <w:t>partir de pesquisa realizada pela Conquer Business School (CONQUER BUSINESS SCHOOL,</w:t>
+        <w:t>realizadas mais de 33 milhões milhões de pesquisas relacionadas ao tema em mecanismos de busca como o Google. A maioria das consultas se concentra em três temas: preferência por cursos a</w:t>
       </w:r>
     </w:p>
     <w:p>
@@ -522,9 +524,10 @@
       </w:pPr>
       <w:r>
         <w:rPr>
+          <w:rFonts w:ascii="Times New Roman" w:hAnsi="Times New Roman"/>
           <w:sz w:val="24"/>
         </w:rPr>
-        <w:t>2025) com base na análise de comportamento digital de usuários da internet, o volume de buscas</w:t>
+        <w:t>distância, dúvidas sobre inscrições e o interesse pela modalidade lato sensu. A procura por termos como “especialização” aumentou 233%, enquanto “pós-graduação lato sensu” registrou alta de</w:t>
       </w:r>
     </w:p>
     <w:p>
@@ -535,71 +538,7 @@
       </w:pPr>
       <w:r>
         <w:rPr>
-          <w:sz w:val="24"/>
-        </w:rPr>
-        <w:t>por cursos de pós-graduação aumentou 22% nos últimos 12 meses no Brasil. Neste período foram</w:t>
-      </w:r>
-    </w:p>
-    <w:p>
-      <w:pPr>
-        <w:spacing w:after="80"/>
-        <w:ind w:firstLine="709"/>
-        <w:jc w:val="both"/>
-      </w:pPr>
-      <w:r>
-        <w:rPr>
-          <w:sz w:val="24"/>
-        </w:rPr>
-        <w:t>realizadas mais de 33 milhões milhões de pesquisas relacionadas ao tema em mecanismos de busca</w:t>
-      </w:r>
-    </w:p>
-    <w:p>
-      <w:pPr>
-        <w:spacing w:after="80"/>
-        <w:ind w:firstLine="709"/>
-        <w:jc w:val="both"/>
-      </w:pPr>
-      <w:r>
-        <w:rPr>
-          <w:sz w:val="24"/>
-        </w:rPr>
-        <w:t>como o Google. A maioria das consultas se concentra em três temas: preferência por cursos a</w:t>
-      </w:r>
-    </w:p>
-    <w:p>
-      <w:pPr>
-        <w:spacing w:after="80"/>
-        <w:ind w:firstLine="709"/>
-        <w:jc w:val="both"/>
-      </w:pPr>
-      <w:r>
-        <w:rPr>
-          <w:sz w:val="24"/>
-        </w:rPr>
-        <w:t>distância, dúvidas sobre inscrições e o interesse pela modalidade lato sensu. A procura por termos</w:t>
-      </w:r>
-    </w:p>
-    <w:p>
-      <w:pPr>
-        <w:spacing w:after="80"/>
-        <w:ind w:firstLine="709"/>
-        <w:jc w:val="both"/>
-      </w:pPr>
-      <w:r>
-        <w:rPr>
-          <w:sz w:val="24"/>
-        </w:rPr>
-        <w:t>como “especialização” aumentou 233%, enquanto “pós-graduação lato sensu” registrou alta de</w:t>
-      </w:r>
-    </w:p>
-    <w:p>
-      <w:pPr>
-        <w:spacing w:after="80"/>
-        <w:ind w:firstLine="709"/>
-        <w:jc w:val="both"/>
-      </w:pPr>
-      <w:r>
-        <w:rPr>
+          <w:rFonts w:ascii="Times New Roman" w:hAnsi="Times New Roman"/>
           <w:sz w:val="24"/>
         </w:rPr>
         <w:t>50%.</w:t>
@@ -613,6 +552,7 @@
       </w:pPr>
       <w:r>
         <w:rPr>
+          <w:rFonts w:ascii="Times New Roman" w:hAnsi="Times New Roman"/>
           <w:sz w:val="24"/>
         </w:rPr>
         <w:t>Tabela 1 - Nível de Instrução da população brasileira com 24 anos ou mais</w:t>
@@ -626,9 +566,10 @@
       </w:pPr>
       <w:r>
         <w:rPr>
+          <w:rFonts w:ascii="Times New Roman" w:hAnsi="Times New Roman"/>
           <w:sz w:val="24"/>
         </w:rPr>
-        <w:t>Nível de Instrução</w:t>
+        <w:t>Nível de Instrução                  Nº              %</w:t>
       </w:r>
     </w:p>
     <w:p>
@@ -639,9 +580,10 @@
       </w:pPr>
       <w:r>
         <w:rPr>
+          <w:rFonts w:ascii="Times New Roman" w:hAnsi="Times New Roman"/>
           <w:sz w:val="24"/>
         </w:rPr>
-        <w:t>Não frequentou</w:t>
+        <w:t>Não frequentou                             6.264.340,00        4,4%</w:t>
       </w:r>
     </w:p>
     <w:p>
@@ -652,9 +594,10 @@
       </w:pPr>
       <w:r>
         <w:rPr>
+          <w:rFonts w:ascii="Times New Roman" w:hAnsi="Times New Roman"/>
           <w:sz w:val="24"/>
         </w:rPr>
-        <w:t>Frequenta</w:t>
+        <w:t>Frequenta                                  7.564.537,00        5,3%</w:t>
       </w:r>
     </w:p>
     <w:p>
@@ -665,9 +608,10 @@
       </w:pPr>
       <w:r>
         <w:rPr>
+          <w:rFonts w:ascii="Times New Roman" w:hAnsi="Times New Roman"/>
           <w:sz w:val="24"/>
         </w:rPr>
-        <w:t>Até ensino fundamental</w:t>
+        <w:t>Até ensino fundamental                     49.346.848,00      34,4%</w:t>
       </w:r>
     </w:p>
     <w:p>
@@ -678,9 +622,10 @@
       </w:pPr>
       <w:r>
         <w:rPr>
+          <w:rFonts w:ascii="Times New Roman" w:hAnsi="Times New Roman"/>
           <w:sz w:val="24"/>
         </w:rPr>
-        <w:t>Ensino médio</w:t>
+        <w:t>Ensino médio                               50.600.815,00      35,3%</w:t>
       </w:r>
     </w:p>
     <w:p>
@@ -691,9 +636,10 @@
       </w:pPr>
       <w:r>
         <w:rPr>
+          <w:rFonts w:ascii="Times New Roman" w:hAnsi="Times New Roman"/>
           <w:sz w:val="24"/>
         </w:rPr>
-        <w:t>Ensino Superior (Graduação)</w:t>
+        <w:t>Ensino Superior (Graduação)                22.374.699,00      15,6%</w:t>
       </w:r>
     </w:p>
     <w:p>
@@ -704,9 +650,10 @@
       </w:pPr>
       <w:r>
         <w:rPr>
+          <w:rFonts w:ascii="Times New Roman" w:hAnsi="Times New Roman"/>
           <w:sz w:val="24"/>
         </w:rPr>
-        <w:t>Especialização de Nível Superior</w:t>
+        <w:t>Especialização de Nível Superior           5.956.291,00        4,2%</w:t>
       </w:r>
     </w:p>
     <w:p>
@@ -717,9 +664,10 @@
       </w:pPr>
       <w:r>
         <w:rPr>
+          <w:rFonts w:ascii="Times New Roman" w:hAnsi="Times New Roman"/>
           <w:sz w:val="24"/>
         </w:rPr>
-        <w:t>Mestrado</w:t>
+        <w:t>Mestrado                                    900.812,00         0,6%</w:t>
       </w:r>
     </w:p>
     <w:p>
@@ -730,9 +678,10 @@
       </w:pPr>
       <w:r>
         <w:rPr>
+          <w:rFonts w:ascii="Times New Roman" w:hAnsi="Times New Roman"/>
           <w:sz w:val="24"/>
         </w:rPr>
-        <w:t>Doutorado</w:t>
+        <w:t>Doutorado                                   404.477,00         0,3%</w:t>
       </w:r>
     </w:p>
     <w:p>
@@ -743,9 +692,10 @@
       </w:pPr>
       <w:r>
         <w:rPr>
+          <w:rFonts w:ascii="Times New Roman" w:hAnsi="Times New Roman"/>
           <w:sz w:val="24"/>
         </w:rPr>
-        <w:t>População 24+</w:t>
+        <w:t>População 24+                             143.412.819,00     100,0%</w:t>
       </w:r>
     </w:p>
     <w:p>
@@ -756,266 +706,7 @@
       </w:pPr>
       <w:r>
         <w:rPr>
-          <w:sz w:val="24"/>
-        </w:rPr>
-        <w:t>Nº</w:t>
-      </w:r>
-    </w:p>
-    <w:p>
-      <w:pPr>
-        <w:spacing w:after="80"/>
-        <w:ind w:firstLine="709"/>
-        <w:jc w:val="both"/>
-      </w:pPr>
-      <w:r>
-        <w:rPr>
-          <w:sz w:val="24"/>
-        </w:rPr>
-        <w:t>6.264.340,00</w:t>
-      </w:r>
-    </w:p>
-    <w:p>
-      <w:pPr>
-        <w:spacing w:after="80"/>
-        <w:ind w:firstLine="709"/>
-        <w:jc w:val="both"/>
-      </w:pPr>
-      <w:r>
-        <w:rPr>
-          <w:sz w:val="24"/>
-        </w:rPr>
-        <w:t>7.564.537,00</w:t>
-      </w:r>
-    </w:p>
-    <w:p>
-      <w:pPr>
-        <w:spacing w:after="80"/>
-        <w:ind w:firstLine="709"/>
-        <w:jc w:val="both"/>
-      </w:pPr>
-      <w:r>
-        <w:rPr>
-          <w:sz w:val="24"/>
-        </w:rPr>
-        <w:t>49.346.848,00</w:t>
-      </w:r>
-    </w:p>
-    <w:p>
-      <w:pPr>
-        <w:spacing w:after="80"/>
-        <w:ind w:firstLine="709"/>
-        <w:jc w:val="both"/>
-      </w:pPr>
-      <w:r>
-        <w:rPr>
-          <w:sz w:val="24"/>
-        </w:rPr>
-        <w:t>50.600.815,00</w:t>
-      </w:r>
-    </w:p>
-    <w:p>
-      <w:pPr>
-        <w:spacing w:after="80"/>
-        <w:ind w:firstLine="709"/>
-        <w:jc w:val="both"/>
-      </w:pPr>
-      <w:r>
-        <w:rPr>
-          <w:sz w:val="24"/>
-        </w:rPr>
-        <w:t>22.374.699,00</w:t>
-      </w:r>
-    </w:p>
-    <w:p>
-      <w:pPr>
-        <w:spacing w:after="80"/>
-        <w:ind w:firstLine="709"/>
-        <w:jc w:val="both"/>
-      </w:pPr>
-      <w:r>
-        <w:rPr>
-          <w:sz w:val="24"/>
-        </w:rPr>
-        <w:t>5.956.291,00</w:t>
-      </w:r>
-    </w:p>
-    <w:p>
-      <w:pPr>
-        <w:spacing w:after="80"/>
-        <w:ind w:firstLine="709"/>
-        <w:jc w:val="both"/>
-      </w:pPr>
-      <w:r>
-        <w:rPr>
-          <w:sz w:val="24"/>
-        </w:rPr>
-        <w:t>900.812,00</w:t>
-      </w:r>
-    </w:p>
-    <w:p>
-      <w:pPr>
-        <w:spacing w:after="80"/>
-        <w:ind w:firstLine="709"/>
-        <w:jc w:val="both"/>
-      </w:pPr>
-      <w:r>
-        <w:rPr>
-          <w:sz w:val="24"/>
-        </w:rPr>
-        <w:t>404.477,00</w:t>
-      </w:r>
-    </w:p>
-    <w:p>
-      <w:pPr>
-        <w:spacing w:after="80"/>
-        <w:ind w:firstLine="709"/>
-        <w:jc w:val="both"/>
-      </w:pPr>
-      <w:r>
-        <w:rPr>
-          <w:sz w:val="24"/>
-        </w:rPr>
-        <w:t>143.412.819,00</w:t>
-      </w:r>
-    </w:p>
-    <w:p>
-      <w:pPr>
-        <w:spacing w:after="80"/>
-        <w:ind w:firstLine="709"/>
-        <w:jc w:val="both"/>
-      </w:pPr>
-      <w:r>
-        <w:rPr>
-          <w:sz w:val="24"/>
-        </w:rPr>
-        <w:t>%</w:t>
-      </w:r>
-    </w:p>
-    <w:p>
-      <w:pPr>
-        <w:spacing w:after="80"/>
-        <w:ind w:firstLine="709"/>
-        <w:jc w:val="both"/>
-      </w:pPr>
-      <w:r>
-        <w:rPr>
-          <w:sz w:val="24"/>
-        </w:rPr>
-        <w:t>4,4%</w:t>
-      </w:r>
-    </w:p>
-    <w:p>
-      <w:pPr>
-        <w:spacing w:after="80"/>
-        <w:ind w:firstLine="709"/>
-        <w:jc w:val="both"/>
-      </w:pPr>
-      <w:r>
-        <w:rPr>
-          <w:sz w:val="24"/>
-        </w:rPr>
-        <w:t>5,3%</w:t>
-      </w:r>
-    </w:p>
-    <w:p>
-      <w:pPr>
-        <w:spacing w:after="80"/>
-        <w:ind w:firstLine="709"/>
-        <w:jc w:val="both"/>
-      </w:pPr>
-      <w:r>
-        <w:rPr>
-          <w:sz w:val="24"/>
-        </w:rPr>
-        <w:t>34,4%</w:t>
-      </w:r>
-    </w:p>
-    <w:p>
-      <w:pPr>
-        <w:spacing w:after="80"/>
-        <w:ind w:firstLine="709"/>
-        <w:jc w:val="both"/>
-      </w:pPr>
-      <w:r>
-        <w:rPr>
-          <w:sz w:val="24"/>
-        </w:rPr>
-        <w:t>35,3%</w:t>
-      </w:r>
-    </w:p>
-    <w:p>
-      <w:pPr>
-        <w:spacing w:after="80"/>
-        <w:ind w:firstLine="709"/>
-        <w:jc w:val="both"/>
-      </w:pPr>
-      <w:r>
-        <w:rPr>
-          <w:sz w:val="24"/>
-        </w:rPr>
-        <w:t>15,6%</w:t>
-      </w:r>
-    </w:p>
-    <w:p>
-      <w:pPr>
-        <w:spacing w:after="80"/>
-        <w:ind w:firstLine="709"/>
-        <w:jc w:val="both"/>
-      </w:pPr>
-      <w:r>
-        <w:rPr>
-          <w:sz w:val="24"/>
-        </w:rPr>
-        <w:t>4,2%</w:t>
-      </w:r>
-    </w:p>
-    <w:p>
-      <w:pPr>
-        <w:spacing w:after="80"/>
-        <w:ind w:firstLine="709"/>
-        <w:jc w:val="both"/>
-      </w:pPr>
-      <w:r>
-        <w:rPr>
-          <w:sz w:val="24"/>
-        </w:rPr>
-        <w:t>0,6%</w:t>
-      </w:r>
-    </w:p>
-    <w:p>
-      <w:pPr>
-        <w:spacing w:after="80"/>
-        <w:ind w:firstLine="709"/>
-        <w:jc w:val="both"/>
-      </w:pPr>
-      <w:r>
-        <w:rPr>
-          <w:sz w:val="24"/>
-        </w:rPr>
-        <w:t>0,3%</w:t>
-      </w:r>
-    </w:p>
-    <w:p>
-      <w:pPr>
-        <w:spacing w:after="80"/>
-        <w:ind w:firstLine="709"/>
-        <w:jc w:val="both"/>
-      </w:pPr>
-      <w:r>
-        <w:rPr>
-          <w:sz w:val="24"/>
-        </w:rPr>
-        <w:t>100,0%</w:t>
-      </w:r>
-    </w:p>
-    <w:p>
-      <w:pPr>
-        <w:spacing w:after="80"/>
-        <w:ind w:firstLine="709"/>
-        <w:jc w:val="both"/>
-      </w:pPr>
-      <w:r>
-        <w:rPr>
+          <w:rFonts w:ascii="Times New Roman" w:hAnsi="Times New Roman"/>
           <w:sz w:val="24"/>
         </w:rPr>
         <w:t>Fonte: Instituto SEMESP base PNAD/IBGE</w:t>
@@ -1029,9 +720,10 @@
       </w:pPr>
       <w:r>
         <w:rPr>
+          <w:rFonts w:ascii="Times New Roman" w:hAnsi="Times New Roman"/>
           <w:sz w:val="24"/>
         </w:rPr>
-        <w:t>A pesquisa realizada pelo Instituto Semesp sobre a pós-graduação lato senso no Brasil, traçando</w:t>
+        <w:t>A pesquisa realizada pelo Instituto Semesp sobre a pós-graduação lato senso no Brasil, traçando um diagnóstico sobre os cursos de especialização no país (CAPELATO et al, 2023) mostra que em</w:t>
       </w:r>
     </w:p>
     <w:p>
@@ -1042,9 +734,10 @@
       </w:pPr>
       <w:r>
         <w:rPr>
+          <w:rFonts w:ascii="Times New Roman" w:hAnsi="Times New Roman"/>
           <w:sz w:val="24"/>
         </w:rPr>
-        <w:t>um diagnóstico sobre os cursos de especialização no país (CAPELATO et al, 2023) mostra que em</w:t>
+        <w:t>2023, o número de estudantes que frequentavam um curso de especialização ultrapassou 1,4 milhão, quantidade 1,3% maior do que no ano anterior. No Mestrado, houve uma queda entre os anos de</w:t>
       </w:r>
     </w:p>
     <w:p>
@@ -1055,9 +748,10 @@
       </w:pPr>
       <w:r>
         <w:rPr>
+          <w:rFonts w:ascii="Times New Roman" w:hAnsi="Times New Roman"/>
           <w:sz w:val="24"/>
         </w:rPr>
-        <w:t>2023, o número de estudantes que frequentavam um curso de especialização ultrapassou 1,4 milhão,</w:t>
+        <w:t>2022 e 2023, de 5,0% e 4,7%, respectivamente. Já entre os alunos de Doutorado, apesar de ter ocorrido uma redução considerável de 19,4% entre os anos de 2021 e 2022, houve pequeno</w:t>
       </w:r>
     </w:p>
     <w:p>
@@ -1068,9 +762,10 @@
       </w:pPr>
       <w:r>
         <w:rPr>
+          <w:rFonts w:ascii="Times New Roman" w:hAnsi="Times New Roman"/>
           <w:sz w:val="24"/>
         </w:rPr>
-        <w:t>quantidade 1,3% maior do que no ano anterior. No Mestrado, houve uma queda entre os anos de</w:t>
+        <w:t>aumento de 2,5% em 2023, chegando a 154 mil matrículas. No Brasil, há mais de 2,1 mil instituições de ensino que ofertam cursos de especialização de nível superior nas modalidades</w:t>
       </w:r>
     </w:p>
     <w:p>
@@ -1081,9 +776,10 @@
       </w:pPr>
       <w:r>
         <w:rPr>
+          <w:rFonts w:ascii="Times New Roman" w:hAnsi="Times New Roman"/>
           <w:sz w:val="24"/>
         </w:rPr>
-        <w:t>2022 e 2023, de 5,0% e 4,7%, respectivamente. Já entre os alunos de Doutorado, apesar de ter</w:t>
+        <w:t>presencial e EAD, sendo que 89,8% delas são privadas. Em torno de 64,5% dessas instituições ofertam cursos de especialização somente na modalidade presencial (1.306 privadas e 89 públicas).</w:t>
       </w:r>
     </w:p>
     <w:p>
@@ -1094,9 +790,10 @@
       </w:pPr>
       <w:r>
         <w:rPr>
+          <w:rFonts w:ascii="Times New Roman" w:hAnsi="Times New Roman"/>
           <w:sz w:val="24"/>
         </w:rPr>
-        <w:t>ocorrido uma redução considerável de 19,4% entre os anos de 2021 e 2022, houve pequeno</w:t>
+        <w:t>Nos anos de 2021 a 2023, houve um aumento de 145% no número de instituições que ofertam cursos a distância. Além disso, entre as instituições privadas, 61,7% são com fins lucrativos. Com</w:t>
       </w:r>
     </w:p>
     <w:p>
@@ -1107,9 +804,10 @@
       </w:pPr>
       <w:r>
         <w:rPr>
+          <w:rFonts w:ascii="Times New Roman" w:hAnsi="Times New Roman"/>
           <w:sz w:val="24"/>
         </w:rPr>
-        <w:t>aumento de 2,5% em 2023, chegando a 154 mil matrículas. No Brasil, há mais de 2,1 mil</w:t>
+        <w:t>relação ao nível de instrução do brasileiro com 24 anos ou mais, a Tabela 1 mostra o quantitativo, conforme estimado pelo PNAD/IBGE, dados que constam do relatório Instituto Semesp.</w:t>
       </w:r>
     </w:p>
     <w:p>
@@ -1120,9 +818,10 @@
       </w:pPr>
       <w:r>
         <w:rPr>
+          <w:rFonts w:ascii="Times New Roman" w:hAnsi="Times New Roman"/>
           <w:sz w:val="24"/>
         </w:rPr>
-        <w:t>instituições de ensino que ofertam cursos de especialização de nível superior nas modalidades</w:t>
+        <w:t>Quando se busca por informações oficiais sobre cursos de pós-graduação no Brasil, verifica-se que há uma separação entre competências: cursos de pós-graduação lato sensu (especialização) são</w:t>
       </w:r>
     </w:p>
     <w:p>
@@ -1133,9 +832,10 @@
       </w:pPr>
       <w:r>
         <w:rPr>
+          <w:rFonts w:ascii="Times New Roman" w:hAnsi="Times New Roman"/>
           <w:sz w:val="24"/>
         </w:rPr>
-        <w:t>presencial e EAD, sendo que 89,8% delas são privadas. Em torno de 64,5% dessas instituições</w:t>
+        <w:t>compilados        e      avaliados   pelo      MEC      e     acessíveis    via    portal    e-MEC</w:t>
       </w:r>
     </w:p>
     <w:p>
@@ -1146,9 +846,10 @@
       </w:pPr>
       <w:r>
         <w:rPr>
+          <w:rFonts w:ascii="Times New Roman" w:hAnsi="Times New Roman"/>
           <w:sz w:val="24"/>
         </w:rPr>
-        <w:t>ofertam cursos de especialização somente na modalidade presencial (1.306 privadas e 89 públicas).</w:t>
+        <w:t>( https://emec.mec.gov.br/emec/nova);         enquanto que cursos de pós-graduação stricto sensu</w:t>
       </w:r>
     </w:p>
     <w:p>
@@ -1159,240 +860,7 @@
       </w:pPr>
       <w:r>
         <w:rPr>
-          <w:sz w:val="24"/>
-        </w:rPr>
-        <w:t>Nos anos de 2021 a 2023, houve um aumento de 145% no número de instituições que ofertam</w:t>
-      </w:r>
-    </w:p>
-    <w:p>
-      <w:pPr>
-        <w:spacing w:after="80"/>
-        <w:ind w:firstLine="709"/>
-        <w:jc w:val="both"/>
-      </w:pPr>
-      <w:r>
-        <w:rPr>
-          <w:sz w:val="24"/>
-        </w:rPr>
-        <w:t>cursos a distância. Além disso, entre as instituições privadas, 61,7% são com fins lucrativos. Com</w:t>
-      </w:r>
-    </w:p>
-    <w:p>
-      <w:pPr>
-        <w:spacing w:after="80"/>
-        <w:ind w:firstLine="709"/>
-        <w:jc w:val="both"/>
-      </w:pPr>
-      <w:r>
-        <w:rPr>
-          <w:sz w:val="24"/>
-        </w:rPr>
-        <w:t>relação ao nível de instrução do brasileiro com 24 anos ou mais, a Tabela 1 mostra o quantitativo,</w:t>
-      </w:r>
-    </w:p>
-    <w:p>
-      <w:pPr>
-        <w:spacing w:after="80"/>
-        <w:ind w:firstLine="709"/>
-        <w:jc w:val="both"/>
-      </w:pPr>
-      <w:r>
-        <w:rPr>
-          <w:sz w:val="24"/>
-        </w:rPr>
-        <w:t>conforme estimado pelo PNAD/IBGE, dados que constam do relatório Instituto Semesp.</w:t>
-      </w:r>
-    </w:p>
-    <w:p>
-      <w:pPr>
-        <w:spacing w:after="80"/>
-        <w:ind w:firstLine="709"/>
-        <w:jc w:val="both"/>
-      </w:pPr>
-      <w:r>
-        <w:rPr>
-          <w:sz w:val="24"/>
-        </w:rPr>
-        <w:t>Quando se busca por informações oficiais sobre cursos de pós-graduação no Brasil, verifica-se que</w:t>
-      </w:r>
-    </w:p>
-    <w:p>
-      <w:pPr>
-        <w:spacing w:after="80"/>
-        <w:ind w:firstLine="709"/>
-        <w:jc w:val="both"/>
-      </w:pPr>
-      <w:r>
-        <w:rPr>
-          <w:sz w:val="24"/>
-        </w:rPr>
-        <w:t>há uma separação entre competências: cursos de pós-graduação lato sensu (especialização) são</w:t>
-      </w:r>
-    </w:p>
-    <w:p>
-      <w:pPr>
-        <w:spacing w:after="80"/>
-        <w:ind w:firstLine="709"/>
-        <w:jc w:val="both"/>
-      </w:pPr>
-      <w:r>
-        <w:rPr>
-          <w:sz w:val="24"/>
-        </w:rPr>
-        <w:t>compilados</w:t>
-      </w:r>
-    </w:p>
-    <w:p>
-      <w:pPr>
-        <w:spacing w:after="80"/>
-        <w:ind w:firstLine="709"/>
-        <w:jc w:val="both"/>
-      </w:pPr>
-      <w:r>
-        <w:rPr>
-          <w:sz w:val="24"/>
-        </w:rPr>
-        <w:t>e</w:t>
-      </w:r>
-    </w:p>
-    <w:p>
-      <w:pPr>
-        <w:spacing w:after="80"/>
-        <w:ind w:firstLine="709"/>
-        <w:jc w:val="both"/>
-      </w:pPr>
-      <w:r>
-        <w:rPr>
-          <w:sz w:val="24"/>
-        </w:rPr>
-        <w:t>avaliados</w:t>
-      </w:r>
-    </w:p>
-    <w:p>
-      <w:pPr>
-        <w:spacing w:after="80"/>
-        <w:ind w:firstLine="709"/>
-        <w:jc w:val="both"/>
-      </w:pPr>
-      <w:r>
-        <w:rPr>
-          <w:sz w:val="24"/>
-        </w:rPr>
-        <w:t>pelo</w:t>
-      </w:r>
-    </w:p>
-    <w:p>
-      <w:pPr>
-        <w:spacing w:after="80"/>
-        <w:ind w:firstLine="709"/>
-        <w:jc w:val="both"/>
-      </w:pPr>
-      <w:r>
-        <w:rPr>
-          <w:sz w:val="24"/>
-        </w:rPr>
-        <w:t>( https://emec.mec.gov.br/emec/nova);</w:t>
-      </w:r>
-    </w:p>
-    <w:p>
-      <w:pPr>
-        <w:spacing w:after="80"/>
-        <w:ind w:firstLine="709"/>
-        <w:jc w:val="both"/>
-      </w:pPr>
-      <w:r>
-        <w:rPr>
-          <w:sz w:val="24"/>
-        </w:rPr>
-        <w:t>MEC</w:t>
-      </w:r>
-    </w:p>
-    <w:p>
-      <w:pPr>
-        <w:spacing w:after="80"/>
-        <w:ind w:firstLine="709"/>
-        <w:jc w:val="both"/>
-      </w:pPr>
-      <w:r>
-        <w:rPr>
-          <w:sz w:val="24"/>
-        </w:rPr>
-        <w:t>e</w:t>
-      </w:r>
-    </w:p>
-    <w:p>
-      <w:pPr>
-        <w:spacing w:after="80"/>
-        <w:ind w:firstLine="709"/>
-        <w:jc w:val="both"/>
-      </w:pPr>
-      <w:r>
-        <w:rPr>
-          <w:sz w:val="24"/>
-        </w:rPr>
-        <w:t>acessíveis</w:t>
-      </w:r>
-    </w:p>
-    <w:p>
-      <w:pPr>
-        <w:spacing w:after="80"/>
-        <w:ind w:firstLine="709"/>
-        <w:jc w:val="both"/>
-      </w:pPr>
-      <w:r>
-        <w:rPr>
-          <w:sz w:val="24"/>
-        </w:rPr>
-        <w:t>via</w:t>
-      </w:r>
-    </w:p>
-    <w:p>
-      <w:pPr>
-        <w:spacing w:after="80"/>
-        <w:ind w:firstLine="709"/>
-        <w:jc w:val="both"/>
-      </w:pPr>
-      <w:r>
-        <w:rPr>
-          <w:sz w:val="24"/>
-        </w:rPr>
-        <w:t>portal</w:t>
-      </w:r>
-    </w:p>
-    <w:p>
-      <w:pPr>
-        <w:spacing w:after="80"/>
-        <w:ind w:firstLine="709"/>
-        <w:jc w:val="both"/>
-      </w:pPr>
-      <w:r>
-        <w:rPr>
-          <w:sz w:val="24"/>
-        </w:rPr>
-        <w:t>e-MEC</w:t>
-      </w:r>
-    </w:p>
-    <w:p>
-      <w:pPr>
-        <w:spacing w:after="80"/>
-        <w:ind w:firstLine="709"/>
-        <w:jc w:val="both"/>
-      </w:pPr>
-      <w:r>
-        <w:rPr>
-          <w:sz w:val="24"/>
-        </w:rPr>
-        <w:t>enquanto que cursos de pós-graduação stricto sensu</w:t>
-      </w:r>
-    </w:p>
-    <w:p>
-      <w:pPr>
-        <w:spacing w:after="80"/>
-        <w:ind w:firstLine="709"/>
-        <w:jc w:val="both"/>
-      </w:pPr>
-      <w:r>
-        <w:rPr>
+          <w:rFonts w:ascii="Times New Roman" w:hAnsi="Times New Roman"/>
           <w:sz w:val="24"/>
         </w:rPr>
         <w:t>(mestrado e doutorado) são avaliados e compilados pela Coordenação de Aperfeiçoamento do</w:t>
@@ -1406,9 +874,10 @@
       </w:pPr>
       <w:r>
         <w:rPr>
+          <w:rFonts w:ascii="Times New Roman" w:hAnsi="Times New Roman"/>
           <w:sz w:val="24"/>
         </w:rPr>
-        <w:t>Pessoal</w:t>
+        <w:t>Pessoal      de       Nível   Superior      (CAPES),    acessíveis   pela    plataforma     Sucupira</w:t>
       </w:r>
     </w:p>
     <w:p>
@@ -1419,9 +888,10 @@
       </w:pPr>
       <w:r>
         <w:rPr>
+          <w:rFonts w:ascii="Times New Roman" w:hAnsi="Times New Roman"/>
           <w:sz w:val="24"/>
         </w:rPr>
-        <w:t>de</w:t>
+        <w:t>(https://sucupira.capes.gov.br/). As notas de avaliação dos cursos possui range diferente entre as duas avaliadoras: o MEC avalia a especialização com nota entre 1 e 5, sendo 4 e 5 notas de nível de</w:t>
       </w:r>
     </w:p>
     <w:p>
@@ -1432,9 +902,10 @@
       </w:pPr>
       <w:r>
         <w:rPr>
+          <w:rFonts w:ascii="Times New Roman" w:hAnsi="Times New Roman"/>
           <w:sz w:val="24"/>
         </w:rPr>
-        <w:t>Nível</w:t>
+        <w:t>excelência; enquanto a CAPES pontua com notas de 1 a 7, sendo que otas 3 a 5 indicam desempenho regular a muito bom em nível nacional, enquanto 6 e 7 indicam excelência</w:t>
       </w:r>
     </w:p>
     <w:p>
@@ -1445,136 +916,7 @@
       </w:pPr>
       <w:r>
         <w:rPr>
-          <w:sz w:val="24"/>
-        </w:rPr>
-        <w:t>Superior</w:t>
-      </w:r>
-    </w:p>
-    <w:p>
-      <w:pPr>
-        <w:spacing w:after="80"/>
-        <w:ind w:firstLine="709"/>
-        <w:jc w:val="both"/>
-      </w:pPr>
-      <w:r>
-        <w:rPr>
-          <w:sz w:val="24"/>
-        </w:rPr>
-        <w:t>(CAPES),</w:t>
-      </w:r>
-    </w:p>
-    <w:p>
-      <w:pPr>
-        <w:spacing w:after="80"/>
-        <w:ind w:firstLine="709"/>
-        <w:jc w:val="both"/>
-      </w:pPr>
-      <w:r>
-        <w:rPr>
-          <w:sz w:val="24"/>
-        </w:rPr>
-        <w:t>acessíveis</w:t>
-      </w:r>
-    </w:p>
-    <w:p>
-      <w:pPr>
-        <w:spacing w:after="80"/>
-        <w:ind w:firstLine="709"/>
-        <w:jc w:val="both"/>
-      </w:pPr>
-      <w:r>
-        <w:rPr>
-          <w:sz w:val="24"/>
-        </w:rPr>
-        <w:t>pela</w:t>
-      </w:r>
-    </w:p>
-    <w:p>
-      <w:pPr>
-        <w:spacing w:after="80"/>
-        <w:ind w:firstLine="709"/>
-        <w:jc w:val="both"/>
-      </w:pPr>
-      <w:r>
-        <w:rPr>
-          <w:sz w:val="24"/>
-        </w:rPr>
-        <w:t>plataforma</w:t>
-      </w:r>
-    </w:p>
-    <w:p>
-      <w:pPr>
-        <w:spacing w:after="80"/>
-        <w:ind w:firstLine="709"/>
-        <w:jc w:val="both"/>
-      </w:pPr>
-      <w:r>
-        <w:rPr>
-          <w:sz w:val="24"/>
-        </w:rPr>
-        <w:t>Sucupira</w:t>
-      </w:r>
-    </w:p>
-    <w:p>
-      <w:pPr>
-        <w:spacing w:after="80"/>
-        <w:ind w:firstLine="709"/>
-        <w:jc w:val="both"/>
-      </w:pPr>
-      <w:r>
-        <w:rPr>
-          <w:sz w:val="24"/>
-        </w:rPr>
-        <w:t>(https://sucupira.capes.gov.br/). As notas de avaliação dos cursos possui range diferente entre as</w:t>
-      </w:r>
-    </w:p>
-    <w:p>
-      <w:pPr>
-        <w:spacing w:after="80"/>
-        <w:ind w:firstLine="709"/>
-        <w:jc w:val="both"/>
-      </w:pPr>
-      <w:r>
-        <w:rPr>
-          <w:sz w:val="24"/>
-        </w:rPr>
-        <w:t>duas avaliadoras: o MEC avalia a especialização com nota entre 1 e 5, sendo 4 e 5 notas de nível de</w:t>
-      </w:r>
-    </w:p>
-    <w:p>
-      <w:pPr>
-        <w:spacing w:after="80"/>
-        <w:ind w:firstLine="709"/>
-        <w:jc w:val="both"/>
-      </w:pPr>
-      <w:r>
-        <w:rPr>
-          <w:sz w:val="24"/>
-        </w:rPr>
-        <w:t>excelência; enquanto a CAPES pontua com notas de 1 a 7, sendo que otas 3 a 5 indicam</w:t>
-      </w:r>
-    </w:p>
-    <w:p>
-      <w:pPr>
-        <w:spacing w:after="80"/>
-        <w:ind w:firstLine="709"/>
-        <w:jc w:val="both"/>
-      </w:pPr>
-      <w:r>
-        <w:rPr>
-          <w:sz w:val="24"/>
-        </w:rPr>
-        <w:t>desempenho regular a muito bom em nível nacional, enquanto 6 e 7 indicam excelência</w:t>
-      </w:r>
-    </w:p>
-    <w:p>
-      <w:pPr>
-        <w:spacing w:after="80"/>
-        <w:ind w:firstLine="709"/>
-        <w:jc w:val="both"/>
-      </w:pPr>
-      <w:r>
-        <w:rPr>
+          <w:rFonts w:ascii="Times New Roman" w:hAnsi="Times New Roman"/>
           <w:sz w:val="24"/>
         </w:rPr>
         <w:t>internacional.</w:t>
@@ -1588,9 +930,10 @@
       </w:pPr>
       <w:r>
         <w:rPr>
+          <w:rFonts w:ascii="Times New Roman" w:hAnsi="Times New Roman"/>
           <w:sz w:val="24"/>
         </w:rPr>
-        <w:t>A busca por informações sobre cursos de especialização são realizadas no portal e-MEC, através da</w:t>
+        <w:t>A busca por informações sobre cursos de especialização são realizadas no portal e-MEC, através da tela de consulta ilustrada na Figura 1. As buscas podem ser feitas por município, estado, cursos e</w:t>
       </w:r>
     </w:p>
     <w:p>
@@ -1601,9 +944,10 @@
       </w:pPr>
       <w:r>
         <w:rPr>
+          <w:rFonts w:ascii="Times New Roman" w:hAnsi="Times New Roman"/>
           <w:sz w:val="24"/>
         </w:rPr>
-        <w:t>tela de consulta ilustrada na Figura 1. As buscas podem ser feitas por município, estado, cursos e</w:t>
+        <w:t>áreas gerais (são definidas 11 áreas gerais nas quais são aglutinadas os cursos), nome da Instituição de Ensino Superior (IES), cursos Ativos/Inativos e por modalidade Presencial/Distância. Já a Capes</w:t>
       </w:r>
     </w:p>
     <w:p>
@@ -1614,9 +958,10 @@
       </w:pPr>
       <w:r>
         <w:rPr>
+          <w:rFonts w:ascii="Times New Roman" w:hAnsi="Times New Roman"/>
           <w:sz w:val="24"/>
         </w:rPr>
-        <w:t>áreas gerais (são definidas 11 áreas gerais nas quais são aglutinadas os cursos), nome da Instituição</w:t>
+        <w:t>possui uma plataforma de busca de dados mais elaborada, baseada em Power BI da Microsoft, com dados georreferenciados, como mostrado na Figura 2. Nesta plataforma pode-se exibir dados</w:t>
       </w:r>
     </w:p>
     <w:p>
@@ -1627,9 +972,10 @@
       </w:pPr>
       <w:r>
         <w:rPr>
+          <w:rFonts w:ascii="Times New Roman" w:hAnsi="Times New Roman"/>
           <w:sz w:val="24"/>
         </w:rPr>
-        <w:t>de Ensino Superior (IES), cursos Ativos/Inativos e por modalidade Presencial/Distância. Já a Capes</w:t>
+        <w:t>geolocalizados por município, estado, nota de avaliação, distribuição de bolsas de estudo e outros parâmetros mais voltados para a gestão de programas de pós-graduação, e não para buscas por</w:t>
       </w:r>
     </w:p>
     <w:p>
@@ -1640,58 +986,7 @@
       </w:pPr>
       <w:r>
         <w:rPr>
-          <w:sz w:val="24"/>
-        </w:rPr>
-        <w:t>possui uma plataforma de busca de dados mais elaborada, baseada em Power BI da Microsoft, com</w:t>
-      </w:r>
-    </w:p>
-    <w:p>
-      <w:pPr>
-        <w:spacing w:after="80"/>
-        <w:ind w:firstLine="709"/>
-        <w:jc w:val="both"/>
-      </w:pPr>
-      <w:r>
-        <w:rPr>
-          <w:sz w:val="24"/>
-        </w:rPr>
-        <w:t>dados georreferenciados, como mostrado na Figura 2. Nesta plataforma pode-se exibir dados</w:t>
-      </w:r>
-    </w:p>
-    <w:p>
-      <w:pPr>
-        <w:spacing w:after="80"/>
-        <w:ind w:firstLine="709"/>
-        <w:jc w:val="both"/>
-      </w:pPr>
-      <w:r>
-        <w:rPr>
-          <w:sz w:val="24"/>
-        </w:rPr>
-        <w:t>geolocalizados por município, estado, nota de avaliação, distribuição de bolsas de estudo e outros</w:t>
-      </w:r>
-    </w:p>
-    <w:p>
-      <w:pPr>
-        <w:spacing w:after="80"/>
-        <w:ind w:firstLine="709"/>
-        <w:jc w:val="both"/>
-      </w:pPr>
-      <w:r>
-        <w:rPr>
-          <w:sz w:val="24"/>
-        </w:rPr>
-        <w:t>parâmetros mais voltados para a gestão de programas de pós-graduação, e não para buscas por</w:t>
-      </w:r>
-    </w:p>
-    <w:p>
-      <w:pPr>
-        <w:spacing w:after="80"/>
-        <w:ind w:firstLine="709"/>
-        <w:jc w:val="both"/>
-      </w:pPr>
-      <w:r>
-        <w:rPr>
+          <w:rFonts w:ascii="Times New Roman" w:hAnsi="Times New Roman"/>
           <w:sz w:val="24"/>
         </w:rPr>
         <w:t>determinada área de pesquisa ou IES em particular.</w:t>
@@ -1705,9 +1000,10 @@
       </w:pPr>
       <w:r>
         <w:rPr>
+          <w:rFonts w:ascii="Times New Roman" w:hAnsi="Times New Roman"/>
           <w:sz w:val="24"/>
         </w:rPr>
-        <w:t>Com base nos dados levantados, fica evidente a crescente demanda por cursos de pós-graduação,</w:t>
+        <w:t>Com base nos dados levantados, fica evidente a crescente demanda por cursos de pós-graduação, especialmente especialização, e a consequente busca de informações pela internet. Por outro lado,</w:t>
       </w:r>
     </w:p>
     <w:p>
@@ -1718,9 +1014,10 @@
       </w:pPr>
       <w:r>
         <w:rPr>
+          <w:rFonts w:ascii="Times New Roman" w:hAnsi="Times New Roman"/>
           <w:sz w:val="24"/>
         </w:rPr>
-        <w:t>especialmente especialização, e a consequente busca de informações pela internet. Por outro lado,</w:t>
+        <w:t>há uma certa dificuldade de localização de informações práticas sobre os cursos ofertados em determinada região, apesar das iniciativas da Capes e MEC, sendo que as ferramentas</w:t>
       </w:r>
     </w:p>
     <w:p>
@@ -1731,9 +1028,10 @@
       </w:pPr>
       <w:r>
         <w:rPr>
+          <w:rFonts w:ascii="Times New Roman" w:hAnsi="Times New Roman"/>
           <w:sz w:val="24"/>
         </w:rPr>
-        <w:t>há uma certa dificuldade de localização de informações práticas sobre os cursos ofertados em</w:t>
+        <w:t>disponibilizadas se prestam mais à realização de estatísticas e obtenção de visões mais gerenciais sobre os cursos. Uma primeira dificuldade em qualquer busca é que não há a possibilidade de</w:t>
       </w:r>
     </w:p>
     <w:p>
@@ -1744,9 +1042,10 @@
       </w:pPr>
       <w:r>
         <w:rPr>
+          <w:rFonts w:ascii="Times New Roman" w:hAnsi="Times New Roman"/>
           <w:sz w:val="24"/>
         </w:rPr>
-        <w:t>determinada região, apesar das iniciativas da Capes e MEC, sendo que as ferramentas</w:t>
+        <w:t>buscas do tipo: relacione os cursos de pós-graduação com nota superior a 3, presenciais, com natureza jurídica privada, com inscrições disponíveis, na área de robótica nas proximidades da</w:t>
       </w:r>
     </w:p>
     <w:p>
@@ -1757,9 +1056,10 @@
       </w:pPr>
       <w:r>
         <w:rPr>
+          <w:rFonts w:ascii="Times New Roman" w:hAnsi="Times New Roman"/>
           <w:sz w:val="24"/>
         </w:rPr>
-        <w:t>disponibilizadas se prestam mais à realização de estatísticas e obtenção de visões mais gerenciais</w:t>
+        <w:t>minha residência. Pesquisas como essa são de interesse de qualquer interessado em cursar pós- graduação, principalmente aqueles que já não tem contato próximo com o ambiente acadêmico e</w:t>
       </w:r>
     </w:p>
     <w:p>
@@ -1770,9 +1070,10 @@
       </w:pPr>
       <w:r>
         <w:rPr>
+          <w:rFonts w:ascii="Times New Roman" w:hAnsi="Times New Roman"/>
           <w:sz w:val="24"/>
         </w:rPr>
-        <w:t>sobre os cursos. Uma primeira dificuldade em qualquer busca é que não há a possibilidade de</w:t>
+        <w:t>estão no mercado de trabalho, e buscam cursos para aprimoramento profissional, elevação de nível de conhecimento ou busca de titulação. O mesmo vale para alunos que buscam carreira acadêmica.</w:t>
       </w:r>
     </w:p>
     <w:p>
@@ -1783,9 +1084,10 @@
       </w:pPr>
       <w:r>
         <w:rPr>
+          <w:rFonts w:ascii="Times New Roman" w:hAnsi="Times New Roman"/>
           <w:sz w:val="24"/>
         </w:rPr>
-        <w:t>buscas do tipo: relacione os cursos de pós-graduação com nota superior a 3, presenciais, com</w:t>
+        <w:t>Uma primeira dificuldade é que os dados estão em locais diferentes, caso se busque por especialização (MEC) ou pós-graduação strito sensu (Capes). Outra dificuldade é a busca dos</w:t>
       </w:r>
     </w:p>
     <w:p>
@@ -1796,9 +1098,10 @@
       </w:pPr>
       <w:r>
         <w:rPr>
+          <w:rFonts w:ascii="Times New Roman" w:hAnsi="Times New Roman"/>
           <w:sz w:val="24"/>
         </w:rPr>
-        <w:t>natureza jurídica privada, com inscrições disponíveis, na área de robótica nas proximidades da</w:t>
+        <w:t>endereços das IES, pois pesquisas nos portais mencionados trazem alguns dados, mas que posteriormente obrigam uma sequência de novas pesquisas na Internet.</w:t>
       </w:r>
     </w:p>
     <w:p>
@@ -1809,110 +1112,7 @@
       </w:pPr>
       <w:r>
         <w:rPr>
-          <w:sz w:val="24"/>
-        </w:rPr>
-        <w:t>minha residência. Pesquisas como essa são de interesse de qualquer interessado em cursar pós-</w:t>
-      </w:r>
-    </w:p>
-    <w:p>
-      <w:pPr>
-        <w:spacing w:after="80"/>
-        <w:ind w:firstLine="709"/>
-        <w:jc w:val="both"/>
-      </w:pPr>
-      <w:r>
-        <w:rPr>
-          <w:sz w:val="24"/>
-        </w:rPr>
-        <w:t>graduação, principalmente aqueles que já não tem contato próximo com o ambiente acadêmico e</w:t>
-      </w:r>
-    </w:p>
-    <w:p>
-      <w:pPr>
-        <w:spacing w:after="80"/>
-        <w:ind w:firstLine="709"/>
-        <w:jc w:val="both"/>
-      </w:pPr>
-      <w:r>
-        <w:rPr>
-          <w:sz w:val="24"/>
-        </w:rPr>
-        <w:t>estão no mercado de trabalho, e buscam cursos para aprimoramento profissional, elevação de nível</w:t>
-      </w:r>
-    </w:p>
-    <w:p>
-      <w:pPr>
-        <w:spacing w:after="80"/>
-        <w:ind w:firstLine="709"/>
-        <w:jc w:val="both"/>
-      </w:pPr>
-      <w:r>
-        <w:rPr>
-          <w:sz w:val="24"/>
-        </w:rPr>
-        <w:t>de conhecimento ou busca de titulação. O mesmo vale para alunos que buscam carreira acadêmica.</w:t>
-      </w:r>
-    </w:p>
-    <w:p>
-      <w:pPr>
-        <w:spacing w:after="80"/>
-        <w:ind w:firstLine="709"/>
-        <w:jc w:val="both"/>
-      </w:pPr>
-      <w:r>
-        <w:rPr>
-          <w:sz w:val="24"/>
-        </w:rPr>
-        <w:t>Uma primeira dificuldade é que os dados estão em locais diferentes, caso se busque por</w:t>
-      </w:r>
-    </w:p>
-    <w:p>
-      <w:pPr>
-        <w:spacing w:after="80"/>
-        <w:ind w:firstLine="709"/>
-        <w:jc w:val="both"/>
-      </w:pPr>
-      <w:r>
-        <w:rPr>
-          <w:sz w:val="24"/>
-        </w:rPr>
-        <w:t>especialização (MEC) ou pós-graduação strito sensu (Capes). Outra dificuldade é a busca dos</w:t>
-      </w:r>
-    </w:p>
-    <w:p>
-      <w:pPr>
-        <w:spacing w:after="80"/>
-        <w:ind w:firstLine="709"/>
-        <w:jc w:val="both"/>
-      </w:pPr>
-      <w:r>
-        <w:rPr>
-          <w:sz w:val="24"/>
-        </w:rPr>
-        <w:t>endereços das IES, pois pesquisas nos portais mencionados trazem alguns dados, mas que</w:t>
-      </w:r>
-    </w:p>
-    <w:p>
-      <w:pPr>
-        <w:spacing w:after="80"/>
-        <w:ind w:firstLine="709"/>
-        <w:jc w:val="both"/>
-      </w:pPr>
-      <w:r>
-        <w:rPr>
-          <w:sz w:val="24"/>
-        </w:rPr>
-        <w:t>posteriormente obrigam uma sequência de novas pesquisas na Internet.</w:t>
-      </w:r>
-    </w:p>
-    <w:p>
-      <w:pPr>
-        <w:spacing w:after="80"/>
-        <w:ind w:firstLine="709"/>
-        <w:jc w:val="both"/>
-      </w:pPr>
-      <w:r>
-        <w:rPr>
+          <w:rFonts w:ascii="Times New Roman" w:hAnsi="Times New Roman"/>
           <w:sz w:val="24"/>
         </w:rPr>
         <w:t>Figura 1 - Tela de busca por informações sobre especialização no e-MEC</w:t>
@@ -1926,6 +1126,7 @@
       </w:pPr>
       <w:r>
         <w:rPr>
+          <w:rFonts w:ascii="Times New Roman" w:hAnsi="Times New Roman"/>
           <w:sz w:val="24"/>
         </w:rPr>
         <w:t>Fonte: https://emec.mec.gov.br/emec/nova</w:t>
@@ -1939,9 +1140,10 @@
       </w:pPr>
       <w:r>
         <w:rPr>
+          <w:rFonts w:ascii="Times New Roman" w:hAnsi="Times New Roman"/>
           <w:sz w:val="24"/>
         </w:rPr>
-        <w:t>Diante disso, evidencia-se a oportunidade de desenvolvimento de uma aplicação WEB que</w:t>
+        <w:t>Diante disso, evidencia-se a oportunidade de desenvolvimento de uma aplicação WEB que possibilite a união das informações disponíveis sobre cursos de especialização, mestrado e</w:t>
       </w:r>
     </w:p>
     <w:p>
@@ -1952,9 +1154,10 @@
       </w:pPr>
       <w:r>
         <w:rPr>
+          <w:rFonts w:ascii="Times New Roman" w:hAnsi="Times New Roman"/>
           <w:sz w:val="24"/>
         </w:rPr>
-        <w:t>possibilite a união das informações disponíveis sobre cursos de especialização, mestrado e</w:t>
+        <w:t>doutorado, públicos e privados, áreas de estudo e suas respectiva avaliações, endereços eletrônicos, períodos de inscrição, etc., numa mesma base de dados, e que permita a busca e comparação entre</w:t>
       </w:r>
     </w:p>
     <w:p>
@@ -1965,32 +1168,7 @@
       </w:pPr>
       <w:r>
         <w:rPr>
-          <w:sz w:val="24"/>
-        </w:rPr>
-        <w:t>doutorado, públicos e privados, áreas de estudo e suas respectiva avaliações, endereços eletrônicos,</w:t>
-      </w:r>
-    </w:p>
-    <w:p>
-      <w:pPr>
-        <w:spacing w:after="80"/>
-        <w:ind w:firstLine="709"/>
-        <w:jc w:val="both"/>
-      </w:pPr>
-      <w:r>
-        <w:rPr>
-          <w:sz w:val="24"/>
-        </w:rPr>
-        <w:t>períodos de inscrição, etc., numa mesma base de dados, e que permita a busca e comparação entre</w:t>
-      </w:r>
-    </w:p>
-    <w:p>
-      <w:pPr>
-        <w:spacing w:after="80"/>
-        <w:ind w:firstLine="709"/>
-        <w:jc w:val="both"/>
-      </w:pPr>
-      <w:r>
-        <w:rPr>
+          <w:rFonts w:ascii="Times New Roman" w:hAnsi="Times New Roman"/>
           <w:sz w:val="24"/>
         </w:rPr>
         <w:t>cursos em determinada área geográfica de interesse.</w:t>
@@ -2004,6 +1182,7 @@
       </w:pPr>
       <w:r>
         <w:rPr>
+          <w:rFonts w:ascii="Times New Roman" w:hAnsi="Times New Roman"/>
           <w:sz w:val="24"/>
         </w:rPr>
         <w:t>Figura 2 - GEOCAPES - Sistema de Informações Georreferenciadas da CAPES</w:t>
@@ -2017,6 +1196,7 @@
       </w:pPr>
       <w:r>
         <w:rPr>
+          <w:rFonts w:ascii="Times New Roman" w:hAnsi="Times New Roman"/>
           <w:sz w:val="24"/>
         </w:rPr>
         <w:t>Fonte: https://geocapes.capes.gov.br/geocapes/</w:t>
@@ -2030,9 +1210,10 @@
       </w:pPr>
       <w:r>
         <w:rPr>
+          <w:rFonts w:ascii="Times New Roman" w:hAnsi="Times New Roman"/>
           <w:sz w:val="24"/>
         </w:rPr>
-        <w:t>A conversa com a comunidade externa ocorreu de forma informal a partir das experiências</w:t>
+        <w:t>A conversa com a comunidade externa ocorreu de forma informal a partir das experiências acadêmicas de Paulo Henrique Eleuterio Falsetti, que atualmente está inserido no ambiente de pós-</w:t>
       </w:r>
     </w:p>
     <w:p>
@@ -2043,9 +1224,10 @@
       </w:pPr>
       <w:r>
         <w:rPr>
+          <w:rFonts w:ascii="Times New Roman" w:hAnsi="Times New Roman"/>
           <w:sz w:val="24"/>
         </w:rPr>
-        <w:t>acadêmicas de Paulo Henrique Eleuterio Falsetti, que atualmente está inserido no ambiente de pósgraduação e mantém contato frequente com estudantes de graduação e recém-formados interessados</w:t>
+        <w:t>graduação e mantém contato frequente com estudantes de graduação e recém-formados interessados em ingressar em programas de mestrado e doutorado. Durante essas interações, realizadas</w:t>
       </w:r>
     </w:p>
     <w:p>
@@ -2056,9 +1238,10 @@
       </w:pPr>
       <w:r>
         <w:rPr>
+          <w:rFonts w:ascii="Times New Roman" w:hAnsi="Times New Roman"/>
           <w:sz w:val="24"/>
         </w:rPr>
-        <w:t>em ingressar em programas de mestrado e doutorado. Durante essas interações, realizadas</w:t>
+        <w:t>principalmente em ambientes universitários e em conversas com colegas e estudantes interessados em seguir carreira acadêmica, foram identificadas dúvidas recorrentes que corroboram o problema</w:t>
       </w:r>
     </w:p>
     <w:p>
@@ -2069,9 +1252,10 @@
       </w:pPr>
       <w:r>
         <w:rPr>
+          <w:rFonts w:ascii="Times New Roman" w:hAnsi="Times New Roman"/>
           <w:sz w:val="24"/>
         </w:rPr>
-        <w:t>principalmente em ambientes universitários e em conversas com colegas e estudantes interessados</w:t>
+        <w:t>evidenciado acima e justificam sua solução. Nesse contexto, o grupo considerou como comunidade externa os estudantes e interessados em ingressar na pós-graduação, que frequentemente buscam</w:t>
       </w:r>
     </w:p>
     <w:p>
@@ -2082,45 +1266,7 @@
       </w:pPr>
       <w:r>
         <w:rPr>
-          <w:sz w:val="24"/>
-        </w:rPr>
-        <w:t>em seguir carreira acadêmica, foram identificadas dúvidas recorrentes que corroboram o problema</w:t>
-      </w:r>
-    </w:p>
-    <w:p>
-      <w:pPr>
-        <w:spacing w:after="80"/>
-        <w:ind w:firstLine="709"/>
-        <w:jc w:val="both"/>
-      </w:pPr>
-      <w:r>
-        <w:rPr>
-          <w:sz w:val="24"/>
-        </w:rPr>
-        <w:t>evidenciado acima e justificam sua solução. Nesse contexto, o grupo considerou como comunidade</w:t>
-      </w:r>
-    </w:p>
-    <w:p>
-      <w:pPr>
-        <w:spacing w:after="80"/>
-        <w:ind w:firstLine="709"/>
-        <w:jc w:val="both"/>
-      </w:pPr>
-      <w:r>
-        <w:rPr>
-          <w:sz w:val="24"/>
-        </w:rPr>
-        <w:t>externa os estudantes e interessados em ingressar na pós-graduação, que frequentemente buscam</w:t>
-      </w:r>
-    </w:p>
-    <w:p>
-      <w:pPr>
-        <w:spacing w:after="80"/>
-        <w:ind w:firstLine="709"/>
-        <w:jc w:val="both"/>
-      </w:pPr>
-      <w:r>
-        <w:rPr>
+          <w:rFonts w:ascii="Times New Roman" w:hAnsi="Times New Roman"/>
           <w:sz w:val="24"/>
         </w:rPr>
         <w:t>informações sobre programas avaliados pelo MEC/Capes.</w:t>
@@ -2134,9 +1280,10 @@
       </w:pPr>
       <w:r>
         <w:rPr>
+          <w:rFonts w:ascii="Times New Roman" w:hAnsi="Times New Roman"/>
           <w:sz w:val="24"/>
         </w:rPr>
-        <w:t>O tema específico a ser trabalhado pelo grupo no Projeto Integrador é o desenvolvimento de uma</w:t>
+        <w:t>O tema específico a ser trabalhado pelo grupo no Projeto Integrador é o desenvolvimento de uma plataforma interativa e georreferenciada para visualização e pesquisa de programas de pós-</w:t>
       </w:r>
     </w:p>
     <w:p>
@@ -2147,9 +1294,10 @@
       </w:pPr>
       <w:r>
         <w:rPr>
+          <w:rFonts w:ascii="Times New Roman" w:hAnsi="Times New Roman"/>
           <w:sz w:val="24"/>
         </w:rPr>
-        <w:t>plataforma interativa e georreferenciada para visualização e pesquisa de programas de pósgraduação no Brasil, abrangendo especializações, mestrados e doutorados, partindo da integração de</w:t>
+        <w:t>graduação no Brasil, abrangendo especializações, mestrados e doutorados, partindo da integração de diferentes fontes de dados, como bases públicas do MEC e Capes, permitindo que usuários</w:t>
       </w:r>
     </w:p>
     <w:p>
@@ -2160,9 +1308,10 @@
       </w:pPr>
       <w:r>
         <w:rPr>
+          <w:rFonts w:ascii="Times New Roman" w:hAnsi="Times New Roman"/>
           <w:sz w:val="24"/>
         </w:rPr>
-        <w:t>diferentes fontes de dados, como bases públicas do MEC e Capes, permitindo que usuários</w:t>
+        <w:t>pesquisem cursos por localização, área de pesquisa, notas de avaliação, palavras-chave e datas de processos seletivos, além de acessar links diretos para os sites dos programas.</w:t>
       </w:r>
     </w:p>
     <w:p>
@@ -2173,9 +1322,10 @@
       </w:pPr>
       <w:r>
         <w:rPr>
+          <w:rFonts w:ascii="Times New Roman" w:hAnsi="Times New Roman"/>
           <w:sz w:val="24"/>
         </w:rPr>
-        <w:t>pesquisem cursos por localização, área de pesquisa, notas de avaliação, palavras-chave e datas de</w:t>
+        <w:t>A solução deste problema se relaciona diretamente com o tema norteador da Univesp, que enfatiza a utilização de tecnologia e integração de dados para ampliar o acesso à informação e apoiar a tomada</w:t>
       </w:r>
     </w:p>
     <w:p>
@@ -2186,45 +1336,7 @@
       </w:pPr>
       <w:r>
         <w:rPr>
-          <w:sz w:val="24"/>
-        </w:rPr>
-        <w:t>processos seletivos, além de acessar links diretos para os sites dos programas.</w:t>
-      </w:r>
-    </w:p>
-    <w:p>
-      <w:pPr>
-        <w:spacing w:after="80"/>
-        <w:ind w:firstLine="709"/>
-        <w:jc w:val="both"/>
-      </w:pPr>
-      <w:r>
-        <w:rPr>
-          <w:sz w:val="24"/>
-        </w:rPr>
-        <w:t>A solução deste problema se relaciona diretamente com o tema norteador da Univesp, que enfatiza a</w:t>
-      </w:r>
-    </w:p>
-    <w:p>
-      <w:pPr>
-        <w:spacing w:after="80"/>
-        <w:ind w:firstLine="709"/>
-        <w:jc w:val="both"/>
-      </w:pPr>
-      <w:r>
-        <w:rPr>
-          <w:sz w:val="24"/>
-        </w:rPr>
-        <w:t>utilização de tecnologia e integração de dados para ampliar o acesso à informação e apoiar a tomada</w:t>
-      </w:r>
-    </w:p>
-    <w:p>
-      <w:pPr>
-        <w:spacing w:after="80"/>
-        <w:ind w:firstLine="709"/>
-        <w:jc w:val="both"/>
-      </w:pPr>
-      <w:r>
-        <w:rPr>
+          <w:rFonts w:ascii="Times New Roman" w:hAnsi="Times New Roman"/>
           <w:sz w:val="24"/>
         </w:rPr>
         <w:t>de decisão educacional. O tema se adéqua perfeitamente à proposta dos cursos de Bacharelado em</w:t>
@@ -2238,9 +1350,10 @@
       </w:pPr>
       <w:r>
         <w:rPr>
+          <w:rFonts w:ascii="Times New Roman" w:hAnsi="Times New Roman"/>
           <w:sz w:val="24"/>
         </w:rPr>
-        <w:t>Ciências de Dados e Tecnologia da Informação, uma vez que demanda a análise e préprocessamento de dados públicos para montagem de um banco de dados (BD) único,</w:t>
+        <w:t>Ciências de Dados e Tecnologia da Informação, uma vez que demanda a análise e pré- processamento de dados públicos para montagem de um banco de dados (BD) único,</w:t>
       </w:r>
     </w:p>
     <w:p>
@@ -2251,6 +1364,7 @@
       </w:pPr>
       <w:r>
         <w:rPr>
+          <w:rFonts w:ascii="Times New Roman" w:hAnsi="Times New Roman"/>
           <w:sz w:val="24"/>
         </w:rPr>
         <w:t>desenvolvimento de identificação de posição geográfica das IES e desenvolvimento de aplicação</w:t>
@@ -2264,9 +1378,10 @@
       </w:pPr>
       <w:r>
         <w:rPr>
+          <w:rFonts w:ascii="Times New Roman" w:hAnsi="Times New Roman"/>
           <w:sz w:val="24"/>
         </w:rPr>
-        <w:t>WEB, integrando tecnologias e de acesso a BD, acesso a plataforma de mapas e desenvolvimento</w:t>
+        <w:t>WEB, integrando tecnologias e de acesso a BD, acesso a plataforma de mapas e desenvolvimento de páginas WEB. Serão utilizados diretamente os conhecimentos adquiridos nos cursos COM300 e</w:t>
       </w:r>
     </w:p>
     <w:p>
@@ -2277,19 +1392,7 @@
       </w:pPr>
       <w:r>
         <w:rPr>
-          <w:sz w:val="24"/>
-        </w:rPr>
-        <w:t>de páginas WEB. Serão utilizados diretamente os conhecimentos adquiridos nos cursos COM300 e</w:t>
-      </w:r>
-    </w:p>
-    <w:p>
-      <w:pPr>
-        <w:spacing w:after="80"/>
-        <w:ind w:firstLine="709"/>
-        <w:jc w:val="both"/>
-      </w:pPr>
-      <w:r>
-        <w:rPr>
+          <w:rFonts w:ascii="Times New Roman" w:hAnsi="Times New Roman"/>
           <w:sz w:val="24"/>
         </w:rPr>
         <w:t>COM320 e cursos de linguagens de programação.</w:t>
@@ -2319,9 +1422,248 @@
       </w:pPr>
       <w:r>
         <w:rPr>
+          <w:rFonts w:ascii="Times New Roman" w:hAnsi="Times New Roman"/>
           <w:sz w:val="24"/>
         </w:rPr>
-        <w:t>2.1 OBJETIVOS.......................................................................................................................12</w:t>
+        <w:t>O objetivo geral deste trabalho é o desenvolvimento de uma plataforma WEB interativa e georreferenciada para visualização e pesquisa de programas de pós-graduação no Brasil,</w:t>
+      </w:r>
+    </w:p>
+    <w:p>
+      <w:pPr>
+        <w:spacing w:after="80"/>
+        <w:ind w:firstLine="709"/>
+        <w:jc w:val="both"/>
+      </w:pPr>
+      <w:r>
+        <w:rPr>
+          <w:rFonts w:ascii="Times New Roman" w:hAnsi="Times New Roman"/>
+          <w:sz w:val="24"/>
+        </w:rPr>
+        <w:t>abrangendo especializações, mestrados e doutorados, partindo da integração de diferentes fontes de dados, como bases públicas do MEC e Capes, permitindo que usuários pesquisem cursos por</w:t>
+      </w:r>
+    </w:p>
+    <w:p>
+      <w:pPr>
+        <w:spacing w:after="80"/>
+        <w:ind w:firstLine="709"/>
+        <w:jc w:val="both"/>
+      </w:pPr>
+      <w:r>
+        <w:rPr>
+          <w:rFonts w:ascii="Times New Roman" w:hAnsi="Times New Roman"/>
+          <w:sz w:val="24"/>
+        </w:rPr>
+        <w:t>localização, área de pesquisa, notas de avaliação, palavras-chave e datas de processos seletivos, além de acessar links diretos para os sites dos programas.</w:t>
+      </w:r>
+    </w:p>
+    <w:p>
+      <w:pPr>
+        <w:spacing w:after="80"/>
+        <w:ind w:firstLine="709"/>
+        <w:jc w:val="both"/>
+      </w:pPr>
+      <w:r>
+        <w:rPr>
+          <w:rFonts w:ascii="Times New Roman" w:hAnsi="Times New Roman"/>
+          <w:sz w:val="24"/>
+        </w:rPr>
+        <w:t>Para o desenvolvimento dessa plataforma, os seguintes objetivos intermediários e específicos deverão ser obtidos:</w:t>
+      </w:r>
+    </w:p>
+    <w:p>
+      <w:pPr>
+        <w:spacing w:after="80"/>
+        <w:ind w:firstLine="709"/>
+        <w:jc w:val="both"/>
+      </w:pPr>
+      <w:r>
+        <w:rPr>
+          <w:rFonts w:ascii="Times New Roman" w:hAnsi="Times New Roman"/>
+          <w:sz w:val="24"/>
+        </w:rPr>
+        <w:t>   Definir dos requisitos da aplicação, definindo-se nesta fase quais as funcionalidades deverão ser implementadas;</w:t>
+      </w:r>
+    </w:p>
+    <w:p>
+      <w:pPr>
+        <w:spacing w:after="80"/>
+        <w:ind w:firstLine="709"/>
+        <w:jc w:val="both"/>
+      </w:pPr>
+      <w:r>
+        <w:rPr>
+          <w:rFonts w:ascii="Times New Roman" w:hAnsi="Times New Roman"/>
+          <w:sz w:val="24"/>
+        </w:rPr>
+        <w:t>   Definir as tecnologias a serem usadas para Banco de Dados, interface de mapas e desenvolvimento WEB;</w:t>
+      </w:r>
+    </w:p>
+    <w:p>
+      <w:pPr>
+        <w:spacing w:after="80"/>
+        <w:ind w:firstLine="709"/>
+        <w:jc w:val="both"/>
+      </w:pPr>
+      <w:r>
+        <w:rPr>
+          <w:rFonts w:ascii="Times New Roman" w:hAnsi="Times New Roman"/>
+          <w:sz w:val="24"/>
+        </w:rPr>
+        <w:t>   Desenvolver o protótipo das telas da aplicação WEB;</w:t>
+      </w:r>
+    </w:p>
+    <w:p>
+      <w:pPr>
+        <w:spacing w:after="80"/>
+        <w:ind w:firstLine="709"/>
+        <w:jc w:val="both"/>
+      </w:pPr>
+      <w:r>
+        <w:rPr>
+          <w:rFonts w:ascii="Times New Roman" w:hAnsi="Times New Roman"/>
+          <w:sz w:val="24"/>
+        </w:rPr>
+        <w:t>   Levantar dados sobre IESs e cursos de pós-graduação a partir das plataformas públicas do</w:t>
+      </w:r>
+    </w:p>
+    <w:p>
+      <w:pPr>
+        <w:spacing w:after="80"/>
+        <w:ind w:firstLine="709"/>
+        <w:jc w:val="both"/>
+      </w:pPr>
+      <w:r>
+        <w:rPr>
+          <w:rFonts w:ascii="Times New Roman" w:hAnsi="Times New Roman"/>
+          <w:sz w:val="24"/>
+        </w:rPr>
+        <w:t>MEC e Capes;</w:t>
+      </w:r>
+    </w:p>
+    <w:p>
+      <w:pPr>
+        <w:spacing w:after="80"/>
+        <w:ind w:firstLine="709"/>
+        <w:jc w:val="both"/>
+      </w:pPr>
+      <w:r>
+        <w:rPr>
+          <w:rFonts w:ascii="Times New Roman" w:hAnsi="Times New Roman"/>
+          <w:sz w:val="24"/>
+        </w:rPr>
+        <w:t>   Pré-processamento dos dados levantados, com filtragens, junções,inserção de coordenadas geográficas das IESs e preparação para inserção em Banco de Dados;</w:t>
+      </w:r>
+    </w:p>
+    <w:p>
+      <w:pPr>
+        <w:spacing w:after="80"/>
+        <w:ind w:firstLine="709"/>
+        <w:jc w:val="both"/>
+      </w:pPr>
+      <w:r>
+        <w:rPr>
+          <w:rFonts w:ascii="Times New Roman" w:hAnsi="Times New Roman"/>
+          <w:sz w:val="24"/>
+        </w:rPr>
+        <w:t>   Definir e implantar ferramenta de controle de versão;</w:t>
+      </w:r>
+    </w:p>
+    <w:p>
+      <w:pPr>
+        <w:spacing w:after="80"/>
+        <w:ind w:firstLine="709"/>
+        <w:jc w:val="both"/>
+      </w:pPr>
+      <w:r>
+        <w:rPr>
+          <w:rFonts w:ascii="Times New Roman" w:hAnsi="Times New Roman"/>
+          <w:sz w:val="24"/>
+        </w:rPr>
+        <w:t>   Modelar o Banco de Dados e populá-lo com os dados preprocessados;</w:t>
+      </w:r>
+    </w:p>
+    <w:p>
+      <w:pPr>
+        <w:spacing w:after="80"/>
+        <w:ind w:firstLine="709"/>
+        <w:jc w:val="both"/>
+      </w:pPr>
+      <w:r>
+        <w:rPr>
+          <w:rFonts w:ascii="Times New Roman" w:hAnsi="Times New Roman"/>
+          <w:sz w:val="24"/>
+        </w:rPr>
+        <w:t>   Desenvolver a interface WEB sua interação com Banco de Dados, através da programação das consultas em SQL;</w:t>
+      </w:r>
+    </w:p>
+    <w:p>
+      <w:pPr>
+        <w:spacing w:after="80"/>
+        <w:ind w:firstLine="709"/>
+        <w:jc w:val="both"/>
+      </w:pPr>
+      <w:r>
+        <w:rPr>
+          <w:rFonts w:ascii="Times New Roman" w:hAnsi="Times New Roman"/>
+          <w:sz w:val="24"/>
+        </w:rPr>
+        <w:t>   Desenvolver a aplicação de visualização em mapas e sua integração com a interface WEB;</w:t>
+      </w:r>
+    </w:p>
+    <w:p>
+      <w:pPr>
+        <w:spacing w:after="80"/>
+        <w:ind w:firstLine="709"/>
+        <w:jc w:val="both"/>
+      </w:pPr>
+      <w:r>
+        <w:rPr>
+          <w:rFonts w:ascii="Times New Roman" w:hAnsi="Times New Roman"/>
+          <w:sz w:val="24"/>
+        </w:rPr>
+        <w:t>   Desenvolver filtros de buscas na aplicação WEB;</w:t>
+      </w:r>
+    </w:p>
+    <w:p>
+      <w:pPr>
+        <w:spacing w:after="80"/>
+        <w:ind w:firstLine="709"/>
+        <w:jc w:val="both"/>
+      </w:pPr>
+      <w:r>
+        <w:rPr>
+          <w:rFonts w:ascii="Times New Roman" w:hAnsi="Times New Roman"/>
+          <w:sz w:val="24"/>
+        </w:rPr>
+        <w:t>   Definir casos de testes da aplicação e protótipos intermediários e realizar correções;</w:t>
+      </w:r>
+    </w:p>
+    <w:p>
+      <w:pPr>
+        <w:spacing w:after="80"/>
+        <w:ind w:firstLine="709"/>
+        <w:jc w:val="both"/>
+      </w:pPr>
+      <w:r>
+        <w:rPr>
+          <w:rFonts w:ascii="Times New Roman" w:hAnsi="Times New Roman"/>
+          <w:sz w:val="24"/>
+        </w:rPr>
+        <w:t>   Instalar o sistema completo em servidor com acesso pela internet;</w:t>
+      </w:r>
+    </w:p>
+    <w:p>
+      <w:pPr>
+        <w:spacing w:after="80"/>
+        <w:ind w:firstLine="709"/>
+        <w:jc w:val="both"/>
+      </w:pPr>
+      <w:r>
+        <w:rPr>
+          <w:rFonts w:ascii="Times New Roman" w:hAnsi="Times New Roman"/>
+          <w:sz w:val="24"/>
+        </w:rPr>
+        <w:t>   Realizar piloto com público acadêmico e não acadêmico, procedendo-se à avaliação dos resultados e definição de etapas futuras de desenvolvimento e melhorias.</w:t>
       </w:r>
     </w:p>
     <w:p>
@@ -2340,9 +1682,178 @@
       </w:pPr>
       <w:r>
         <w:rPr>
+          <w:rFonts w:ascii="Times New Roman" w:hAnsi="Times New Roman"/>
           <w:sz w:val="24"/>
         </w:rPr>
-        <w:t>2.2 JUSTIFICATIVA E DELIMITAÇÃO DO PROBLEMA .................................................14</w:t>
+        <w:t>A pergunta que motiva o presente desenvolvimento pode ser formulada da seguinte forma: de que forma a aplicação dos conhecimentos adquiridos até o momento nos cursos de Bacharelado em</w:t>
+      </w:r>
+    </w:p>
+    <w:p>
+      <w:pPr>
+        <w:spacing w:after="80"/>
+        <w:ind w:firstLine="709"/>
+        <w:jc w:val="both"/>
+      </w:pPr>
+      <w:r>
+        <w:rPr>
+          <w:rFonts w:ascii="Times New Roman" w:hAnsi="Times New Roman"/>
+          <w:sz w:val="24"/>
+        </w:rPr>
+        <w:t>Ciência de Dados e Tecnologia da Informação poderia contribuir para facilitar e democratizar a visualização e pesquisa de programas de pós-graduação no Brasil, abrangendo especializações,</w:t>
+      </w:r>
+    </w:p>
+    <w:p>
+      <w:pPr>
+        <w:spacing w:after="80"/>
+        <w:ind w:firstLine="709"/>
+        <w:jc w:val="both"/>
+      </w:pPr>
+      <w:r>
+        <w:rPr>
+          <w:rFonts w:ascii="Times New Roman" w:hAnsi="Times New Roman"/>
+          <w:sz w:val="24"/>
+        </w:rPr>
+        <w:t>mestrados e doutorados, e de que forma poderia integrar diferentes fontes de dados públicas sobre pós-graduação, de tal forma a permitir que usuários pesquisem cursos por localização, área de</w:t>
+      </w:r>
+    </w:p>
+    <w:p>
+      <w:pPr>
+        <w:spacing w:after="80"/>
+        <w:ind w:firstLine="709"/>
+        <w:jc w:val="both"/>
+      </w:pPr>
+      <w:r>
+        <w:rPr>
+          <w:rFonts w:ascii="Times New Roman" w:hAnsi="Times New Roman"/>
+          <w:sz w:val="24"/>
+        </w:rPr>
+        <w:t>pesquisa, notas de avaliação, palavras-chave e datas de processos seletivos, além de acessar links diretos para os sites dos programas, tudo isso de forma simples pela internet, seja do computador</w:t>
+      </w:r>
+    </w:p>
+    <w:p>
+      <w:pPr>
+        <w:spacing w:after="80"/>
+        <w:ind w:firstLine="709"/>
+        <w:jc w:val="both"/>
+      </w:pPr>
+      <w:r>
+        <w:rPr>
+          <w:rFonts w:ascii="Times New Roman" w:hAnsi="Times New Roman"/>
+          <w:sz w:val="24"/>
+        </w:rPr>
+        <w:t>ou celular ?</w:t>
+      </w:r>
+    </w:p>
+    <w:p>
+      <w:pPr>
+        <w:spacing w:after="80"/>
+        <w:ind w:firstLine="709"/>
+        <w:jc w:val="both"/>
+      </w:pPr>
+      <w:r>
+        <w:rPr>
+          <w:rFonts w:ascii="Times New Roman" w:hAnsi="Times New Roman"/>
+          <w:sz w:val="24"/>
+        </w:rPr>
+        <w:t>De acordo com dados fornecidos na Introdução, as pesquisas sobre pós-graduação na Internet possuem grande relevância, assim como o interesse por cursos de pós-graduação, especialmente</w:t>
+      </w:r>
+    </w:p>
+    <w:p>
+      <w:pPr>
+        <w:spacing w:after="80"/>
+        <w:ind w:firstLine="709"/>
+        <w:jc w:val="both"/>
+      </w:pPr>
+      <w:r>
+        <w:rPr>
+          <w:rFonts w:ascii="Times New Roman" w:hAnsi="Times New Roman"/>
+          <w:sz w:val="24"/>
+        </w:rPr>
+        <w:t>especialização, evidenciando-se a falta de integração das bases de dados públicas, bem com a dificuldade de busca direta de dados práticos, sendo necessário inúmeras pesquisas para obtenção</w:t>
+      </w:r>
+    </w:p>
+    <w:p>
+      <w:pPr>
+        <w:spacing w:after="80"/>
+        <w:ind w:firstLine="709"/>
+        <w:jc w:val="both"/>
+      </w:pPr>
+      <w:r>
+        <w:rPr>
+          <w:rFonts w:ascii="Times New Roman" w:hAnsi="Times New Roman"/>
+          <w:sz w:val="24"/>
+        </w:rPr>
+        <w:t>de resultados práticos e comparáveis entre si. O assunto possui relativa relevância social pois como os números apontaram nas pesquisas mencionadas, há um contingente grande de brasileiros</w:t>
+      </w:r>
+    </w:p>
+    <w:p>
+      <w:pPr>
+        <w:spacing w:after="80"/>
+        <w:ind w:firstLine="709"/>
+        <w:jc w:val="both"/>
+      </w:pPr>
+      <w:r>
+        <w:rPr>
+          <w:rFonts w:ascii="Times New Roman" w:hAnsi="Times New Roman"/>
+          <w:sz w:val="24"/>
+        </w:rPr>
+        <w:t>interessados na realização de consultas para direcionar suas escolhas e investimento na pós- graduação.</w:t>
+      </w:r>
+    </w:p>
+    <w:p>
+      <w:pPr>
+        <w:spacing w:after="80"/>
+        <w:ind w:firstLine="709"/>
+        <w:jc w:val="both"/>
+      </w:pPr>
+      <w:r>
+        <w:rPr>
+          <w:rFonts w:ascii="Times New Roman" w:hAnsi="Times New Roman"/>
+          <w:sz w:val="24"/>
+        </w:rPr>
+        <w:t>O projeto não se propõe a trazer inovações tecnológicas ou acadêmicas, mas poderá resultar em um protótipo útil para integração de dados públicos com relevância acadêmica indireta, uma vez que</w:t>
+      </w:r>
+    </w:p>
+    <w:p>
+      <w:pPr>
+        <w:spacing w:after="80"/>
+        <w:ind w:firstLine="709"/>
+        <w:jc w:val="both"/>
+      </w:pPr>
+      <w:r>
+        <w:rPr>
+          <w:rFonts w:ascii="Times New Roman" w:hAnsi="Times New Roman"/>
+          <w:sz w:val="24"/>
+        </w:rPr>
+        <w:t>poderá simplificar, popularizar e evidenciar melhores opções de pós-graduação, a partir do eventual interessado em cursar pós-graduação, por critérios que normalmente não são combinados nas</w:t>
+      </w:r>
+    </w:p>
+    <w:p>
+      <w:pPr>
+        <w:spacing w:after="80"/>
+        <w:ind w:firstLine="709"/>
+        <w:jc w:val="both"/>
+      </w:pPr>
+      <w:r>
+        <w:rPr>
+          <w:rFonts w:ascii="Times New Roman" w:hAnsi="Times New Roman"/>
+          <w:sz w:val="24"/>
+        </w:rPr>
+        <w:t>ferramentas de busca disponibilizadas pelo MEC e Capes. Portanto, sua grande relevância é para o público universitário que pretende cursar pós-graduação ou profissionais de nível superior em busca</w:t>
+      </w:r>
+    </w:p>
+    <w:p>
+      <w:pPr>
+        <w:spacing w:after="80"/>
+        <w:ind w:firstLine="709"/>
+        <w:jc w:val="both"/>
+      </w:pPr>
+      <w:r>
+        <w:rPr>
+          <w:rFonts w:ascii="Times New Roman" w:hAnsi="Times New Roman"/>
+          <w:sz w:val="24"/>
+        </w:rPr>
+        <w:t>de aperfeiçoamento e atualização.</w:t>
       </w:r>
     </w:p>
     <w:p>
@@ -2361,9 +1872,318 @@
       </w:pPr>
       <w:r>
         <w:rPr>
+          <w:rFonts w:ascii="Times New Roman" w:hAnsi="Times New Roman"/>
           <w:sz w:val="24"/>
         </w:rPr>
-        <w:t>2.3 FUNDAMENTAÇÃO TEÓRICA......................................................................................15</w:t>
+        <w:t>O desenvolvimento de uma plataforma WEB interativa e georreferenciada para visualização de programas de pós-graduação exige a articulação de diferentes conceitos computacionais. Para que</w:t>
+      </w:r>
+    </w:p>
+    <w:p>
+      <w:pPr>
+        <w:spacing w:after="80"/>
+        <w:ind w:firstLine="709"/>
+        <w:jc w:val="both"/>
+      </w:pPr>
+      <w:r>
+        <w:rPr>
+          <w:rFonts w:ascii="Times New Roman" w:hAnsi="Times New Roman"/>
+          <w:sz w:val="24"/>
+        </w:rPr>
+        <w:t>os dados dispersos em diferentes sites e fontes institucionais sejam unificados de forma coerente e apresentem utilidade prática ao usuário final, a base teórica deste trabalho apoia-se em três pilares</w:t>
+      </w:r>
+    </w:p>
+    <w:p>
+      <w:pPr>
+        <w:spacing w:after="80"/>
+        <w:ind w:firstLine="709"/>
+        <w:jc w:val="both"/>
+      </w:pPr>
+      <w:r>
+        <w:rPr>
+          <w:rFonts w:ascii="Times New Roman" w:hAnsi="Times New Roman"/>
+          <w:sz w:val="24"/>
+        </w:rPr>
+        <w:t>principais: Sistemas de Informação Geográfica (SIG) na Web, Integração de Banco de Dados e</w:t>
+      </w:r>
+    </w:p>
+    <w:p>
+      <w:pPr>
+        <w:spacing w:after="80"/>
+        <w:ind w:firstLine="709"/>
+        <w:jc w:val="both"/>
+      </w:pPr>
+      <w:r>
+        <w:rPr>
+          <w:rFonts w:ascii="Times New Roman" w:hAnsi="Times New Roman"/>
+          <w:sz w:val="24"/>
+        </w:rPr>
+        <w:t>Visualização de Dados.</w:t>
+      </w:r>
+    </w:p>
+    <w:p>
+      <w:pPr>
+        <w:spacing w:after="80"/>
+        <w:ind w:firstLine="709"/>
+        <w:jc w:val="both"/>
+      </w:pPr>
+      <w:r>
+        <w:rPr>
+          <w:rFonts w:ascii="Times New Roman" w:hAnsi="Times New Roman"/>
+          <w:sz w:val="24"/>
+        </w:rPr>
+        <w:t>2.3.1 Sistemas de Informação Geográfica (SIG) e WebGIS</w:t>
+      </w:r>
+    </w:p>
+    <w:p>
+      <w:pPr>
+        <w:spacing w:after="80"/>
+        <w:ind w:firstLine="709"/>
+        <w:jc w:val="both"/>
+      </w:pPr>
+      <w:r>
+        <w:rPr>
+          <w:rFonts w:ascii="Times New Roman" w:hAnsi="Times New Roman"/>
+          <w:sz w:val="24"/>
+        </w:rPr>
+        <w:t>A escolha da ferramenta OpenStreetMap como plataforma de mapas interativa insere o projeto diretamente no campo dos Sistemas de Informação Geográfica (SIG). O SIG é aplicado para</w:t>
+      </w:r>
+    </w:p>
+    <w:p>
+      <w:pPr>
+        <w:spacing w:after="80"/>
+        <w:ind w:firstLine="709"/>
+        <w:jc w:val="both"/>
+      </w:pPr>
+      <w:r>
+        <w:rPr>
+          <w:rFonts w:ascii="Times New Roman" w:hAnsi="Times New Roman"/>
+          <w:sz w:val="24"/>
+        </w:rPr>
+        <w:t>realizar o tratamento computacional de dados e recuperar informações não apenas por suas tabelas literais, mas sobretudo através de sua localização no espaço geográfico (CÂMARA; DAVIS, 2001).</w:t>
+      </w:r>
+    </w:p>
+    <w:p>
+      <w:pPr>
+        <w:spacing w:after="80"/>
+        <w:ind w:firstLine="709"/>
+        <w:jc w:val="both"/>
+      </w:pPr>
+      <w:r>
+        <w:rPr>
+          <w:rFonts w:ascii="Times New Roman" w:hAnsi="Times New Roman"/>
+          <w:sz w:val="24"/>
+        </w:rPr>
+        <w:t>Com o avanço e a democratização da internet, o SIG clássico evoluiu para o modelo de WebGIS, que consiste na infraestrutura tecnológica capaz de disponibilizar, processar e permitir a</w:t>
+      </w:r>
+    </w:p>
+    <w:p>
+      <w:pPr>
+        <w:spacing w:after="80"/>
+        <w:ind w:firstLine="709"/>
+        <w:jc w:val="both"/>
+      </w:pPr>
+      <w:r>
+        <w:rPr>
+          <w:rFonts w:ascii="Times New Roman" w:hAnsi="Times New Roman"/>
+          <w:sz w:val="24"/>
+        </w:rPr>
+        <w:t>manipulação de mapas dinâmicos diretamente em navegadores web. Essa evolução dispensa a necessidade de softwares desktop especializados instalados na máquina do usuário final, sendo um</w:t>
+      </w:r>
+    </w:p>
+    <w:p>
+      <w:pPr>
+        <w:spacing w:after="80"/>
+        <w:ind w:firstLine="709"/>
+        <w:jc w:val="both"/>
+      </w:pPr>
+      <w:r>
+        <w:rPr>
+          <w:rFonts w:ascii="Times New Roman" w:hAnsi="Times New Roman"/>
+          <w:sz w:val="24"/>
+        </w:rPr>
+        <w:t>requisito arquitetônico essencial para plataformas públicas de consulta acadêmica.</w:t>
+      </w:r>
+    </w:p>
+    <w:p>
+      <w:pPr>
+        <w:spacing w:after="80"/>
+        <w:ind w:firstLine="709"/>
+        <w:jc w:val="both"/>
+      </w:pPr>
+      <w:r>
+        <w:rPr>
+          <w:rFonts w:ascii="Times New Roman" w:hAnsi="Times New Roman"/>
+          <w:sz w:val="24"/>
+        </w:rPr>
+        <w:t>2.3.2 Integração de Dados Heterogêneos</w:t>
+      </w:r>
+    </w:p>
+    <w:p>
+      <w:pPr>
+        <w:spacing w:after="80"/>
+        <w:ind w:firstLine="709"/>
+        <w:jc w:val="both"/>
+      </w:pPr>
+      <w:r>
+        <w:rPr>
+          <w:rFonts w:ascii="Times New Roman" w:hAnsi="Times New Roman"/>
+          <w:sz w:val="24"/>
+        </w:rPr>
+        <w:t>O desafio técnico de unificar as informações de cursos de especialização avaliados pelo MEC com os programas de pós-graduação stricto sensu regidos pela CAPES demanda metodologias robustas</w:t>
+      </w:r>
+    </w:p>
+    <w:p>
+      <w:pPr>
+        <w:spacing w:after="80"/>
+        <w:ind w:firstLine="709"/>
+        <w:jc w:val="both"/>
+      </w:pPr>
+      <w:r>
+        <w:rPr>
+          <w:rFonts w:ascii="Times New Roman" w:hAnsi="Times New Roman"/>
+          <w:sz w:val="24"/>
+        </w:rPr>
+        <w:t>de integração de dados. Segundo Santos e Dias (2022), o processo de integração em sistemas de informação envolve a extração, a consolidação de metadados e a resolução de conflitos semânticos</w:t>
+      </w:r>
+    </w:p>
+    <w:p>
+      <w:pPr>
+        <w:spacing w:after="80"/>
+        <w:ind w:firstLine="709"/>
+        <w:jc w:val="both"/>
+      </w:pPr>
+      <w:r>
+        <w:rPr>
+          <w:rFonts w:ascii="Times New Roman" w:hAnsi="Times New Roman"/>
+          <w:sz w:val="24"/>
+        </w:rPr>
+        <w:t>e estruturais de diferentes fontes independentes para a formação de um repositório central.</w:t>
+      </w:r>
+    </w:p>
+    <w:p>
+      <w:pPr>
+        <w:spacing w:after="80"/>
+        <w:ind w:firstLine="709"/>
+        <w:jc w:val="both"/>
+      </w:pPr>
+      <w:r>
+        <w:rPr>
+          <w:rFonts w:ascii="Times New Roman" w:hAnsi="Times New Roman"/>
+          <w:sz w:val="24"/>
+        </w:rPr>
+        <w:t>No escopo deste projeto, essa base unificada foi preprocessada e estruturada utilizando o SGBD</w:t>
+      </w:r>
+    </w:p>
+    <w:p>
+      <w:pPr>
+        <w:spacing w:after="80"/>
+        <w:ind w:firstLine="709"/>
+        <w:jc w:val="both"/>
+      </w:pPr>
+      <w:r>
+        <w:rPr>
+          <w:rFonts w:ascii="Times New Roman" w:hAnsi="Times New Roman"/>
+          <w:sz w:val="24"/>
+        </w:rPr>
+        <w:t>MySQL. A modelagem relacional bem definida é o que viabiliza, no lado da aplicação, a execução de consultas complexas que filtram variáveis cruzadas como localização territorial, área específica</w:t>
+      </w:r>
+    </w:p>
+    <w:p>
+      <w:pPr>
+        <w:spacing w:after="80"/>
+        <w:ind w:firstLine="709"/>
+        <w:jc w:val="both"/>
+      </w:pPr>
+      <w:r>
+        <w:rPr>
+          <w:rFonts w:ascii="Times New Roman" w:hAnsi="Times New Roman"/>
+          <w:sz w:val="24"/>
+        </w:rPr>
+        <w:t>de pesquisa e a nota de avaliação da instituição.</w:t>
+      </w:r>
+    </w:p>
+    <w:p>
+      <w:pPr>
+        <w:spacing w:after="80"/>
+        <w:ind w:firstLine="709"/>
+        <w:jc w:val="both"/>
+      </w:pPr>
+      <w:r>
+        <w:rPr>
+          <w:rFonts w:ascii="Times New Roman" w:hAnsi="Times New Roman"/>
+          <w:sz w:val="24"/>
+        </w:rPr>
+        <w:t>2.3.3 Visualização de Dados e Acesso à Informação</w:t>
+      </w:r>
+    </w:p>
+    <w:p>
+      <w:pPr>
+        <w:spacing w:after="80"/>
+        <w:ind w:firstLine="709"/>
+        <w:jc w:val="both"/>
+      </w:pPr>
+      <w:r>
+        <w:rPr>
+          <w:rFonts w:ascii="Times New Roman" w:hAnsi="Times New Roman"/>
+          <w:sz w:val="24"/>
+        </w:rPr>
+        <w:t>A justificativa para a criação deste sistema reside no contraste entre o aumento significativo (22% em doze meses) no volume de buscas por especializações e a marcante dificuldade técnica para a</w:t>
+      </w:r>
+    </w:p>
+    <w:p>
+      <w:pPr>
+        <w:spacing w:after="80"/>
+        <w:ind w:firstLine="709"/>
+        <w:jc w:val="both"/>
+      </w:pPr>
+      <w:r>
+        <w:rPr>
+          <w:rFonts w:ascii="Times New Roman" w:hAnsi="Times New Roman"/>
+          <w:sz w:val="24"/>
+        </w:rPr>
+        <w:t>localização e o cruzamento de informações práticas e regionalizadas. Desse modo, o projeto emprega conceitos de visualização de dados e Interação Humano-Computador (IHC) para mitigar a</w:t>
+      </w:r>
+    </w:p>
+    <w:p>
+      <w:pPr>
+        <w:spacing w:after="80"/>
+        <w:ind w:firstLine="709"/>
+        <w:jc w:val="both"/>
+      </w:pPr>
+      <w:r>
+        <w:rPr>
+          <w:rFonts w:ascii="Times New Roman" w:hAnsi="Times New Roman"/>
+          <w:sz w:val="24"/>
+        </w:rPr>
+        <w:t>carga cognitiva do estudante. O emprego de painéis e filtros interativos no desenvolvimento WEB atua como um facilitador no processo de Descoberta de Conhecimento (Knowledge Discovery),</w:t>
+      </w:r>
+    </w:p>
+    <w:p>
+      <w:pPr>
+        <w:spacing w:after="80"/>
+        <w:ind w:firstLine="709"/>
+        <w:jc w:val="both"/>
+      </w:pPr>
+      <w:r>
+        <w:rPr>
+          <w:rFonts w:ascii="Times New Roman" w:hAnsi="Times New Roman"/>
+          <w:sz w:val="24"/>
+        </w:rPr>
+        <w:t>traduzindo dados brutos e tabulares em representações visuais de fácil navegação e absorção</w:t>
+      </w:r>
+    </w:p>
+    <w:p>
+      <w:pPr>
+        <w:spacing w:after="80"/>
+        <w:ind w:firstLine="709"/>
+        <w:jc w:val="both"/>
+      </w:pPr>
+      <w:r>
+        <w:rPr>
+          <w:rFonts w:ascii="Times New Roman" w:hAnsi="Times New Roman"/>
+          <w:sz w:val="24"/>
+        </w:rPr>
+        <w:t>(PRESSMAN, 2011).</w:t>
       </w:r>
     </w:p>
     <w:p>
@@ -2384,7 +2204,7 @@
         <w:rPr>
           <w:sz w:val="24"/>
         </w:rPr>
-        <w:t>O desenvolvimento deste Projeto Integrador mobilizou conhecimentos adquiridos em diversas disciplinas do curso de Bacharelado em Ciência de Dados e Tecnologia da Informação da UNIVESP. A seguir, descrevem-se as principais disciplinas cujos conteúdos foram aplicados diretamente na construção da plataforma.</w:t>
+        <w:t>O desenvolvimento deste Projeto Integrador mobilizou conhecimentos de diversas disciplinas do curso de Bacharelado em Ciência de Dados e Tecnologia da Informação da UNIVESP.</w:t>
       </w:r>
     </w:p>
     <w:p>
@@ -2397,7 +2217,7 @@
         <w:rPr>
           <w:sz w:val="24"/>
         </w:rPr>
-        <w:t>COM120 — Algoritmos e Programação de Computadores II: Os conceitos de estruturas de dados, manipulação de arquivos e organização de código orientada a objetos foram fundamentais para estruturar o backend da aplicação em Django. O modelo entidade-relacionamento (MER) do banco de dados, com tabelas normalizadas para estados, cidades, IES e cursos, foi projetado com base nos princípios de modelagem de dados estudados nesta disciplina. A lógica de importação dos arquivos CSV com 576 IES e 7.488 cursos utilizou técnicas de processamento de dados em lote com controle transacional, garantindo a integridade referencial entre as entidades.</w:t>
+        <w:t>COM120 — Algoritmos e Programação de Computadores II: Os conceitos de estruturas de dados e organização de código orientada a objetos foram fundamentais para estruturar o backend Django. O modelo entidade-relacionamento (MER) do banco de dados foi projetado com base nos princípios de modelagem de dados. A importação dos arquivos CSV com 576 IES e 7.488 cursos utilizou técnicas de processamento em lote com controle transacional.</w:t>
       </w:r>
     </w:p>
     <w:p>
@@ -2410,7 +2230,7 @@
         <w:rPr>
           <w:sz w:val="24"/>
         </w:rPr>
-        <w:t>COM130 — Fundamentos de Internet e Web: Esta disciplina forneceu a base para o desenvolvimento da interface web da plataforma. A arquitetura cliente-servidor implementada com Django (servidor) e Leaflet.js + Bootstrap 5 (cliente) segue os padrões estudados de comunicação HTTP, APIs RESTful e renderização de conteúdo dinâmico. O consumo da API de geocodificação do OpenStreetMap (Nominatim) para busca por endereço e CEP exemplifica a integração de serviços web externos, tópico central da disciplina. A publicação do protótipo na plataforma Railway, com Gunicorn e Whitenoise, aplica os conceitos de deploy de aplicações web.</w:t>
+        <w:t>COM130 — Fundamentos de Internet e Web: A arquitetura cliente-servidor com Django e Leaflet.js segue os padrões de comunicação HTTP e APIs RESTful. O consumo da API Nominatim (OpenStreetMap) para geocodificação exemplifica integração de serviços web. O deploy em Railway com Gunicorn aplica conceitos de infraestrutura web.</w:t>
       </w:r>
     </w:p>
     <w:p>
@@ -2423,7 +2243,7 @@
         <w:rPr>
           <w:sz w:val="24"/>
         </w:rPr>
-        <w:t>COM150 — Fundamentos Matemáticos para Computação: O cálculo de distâncias geográficas entre pontos no mapa utiliza a Fórmula de Haversine, que aplica trigonometria esférica para determinar a distância entre duas coordenadas de latitude e longitude sobre a superfície terrestre. As estatísticas do dashboard — médias de notas CAPES por UF, contagens e agregações — baseiam-se nos fundamentos de estatística descritiva e álgebra relacional estudados na disciplina. A clusterização de marcadores no mapa (via Leaflet.markercluster) emprega conceitos de agrupamento espacial e otimização de desempenho.</w:t>
+        <w:t>COM150 — Fundamentos Matemáticos para Computação: O cálculo de distâncias geográficas utiliza a Fórmula de Haversine (trigonometria esférica). As estatísticas do dashboard — médias por UF e agregações — baseiam-se em estatística descritiva. A clusterização de marcadores emprega conceitos de agrupamento espacial.</w:t>
       </w:r>
     </w:p>
     <w:p>
@@ -2436,7 +2256,7 @@
         <w:rPr>
           <w:sz w:val="24"/>
         </w:rPr>
-        <w:t>Além destas, COM100 — Algoritmos e Programação de Computadores I forneceu a lógica de programação fundamental; as disciplinas de Projeto Integrador anteriores estabeleceram a metodologia de trabalho colaborativo e a abordagem de Design Thinking que orientou o ciclo de desenvolvimento do protótipo.</w:t>
+        <w:t>Além destas, COM100 — Algoritmos e Programação de Computadores I forneceu a lógica de programação fundamental; as disciplinas de Projeto Integrador anteriores estabeleceram a metodologia de Design Thinking que orientou o ciclo de desenvolvimento.</w:t>
       </w:r>
     </w:p>
     <w:p>
@@ -2455,9 +2275,1102 @@
       </w:pPr>
       <w:r>
         <w:rPr>
+          <w:rFonts w:ascii="Times New Roman" w:hAnsi="Times New Roman"/>
           <w:sz w:val="24"/>
         </w:rPr>
-        <w:t>2.4 METODOLOGIA...............................................................................................................17</w:t>
+        <w:t>Para o desenvolvimento da solução proposta utilizar-se-á a metodologia descrita a seguir, tendo em vista o atingimento dos objetivos intermediários para chegar-se à solução completa:</w:t>
+      </w:r>
+    </w:p>
+    <w:p>
+      <w:pPr>
+        <w:spacing w:after="80"/>
+        <w:ind w:firstLine="709"/>
+        <w:jc w:val="both"/>
+      </w:pPr>
+      <w:r>
+        <w:rPr>
+          <w:rFonts w:ascii="Times New Roman" w:hAnsi="Times New Roman"/>
+          <w:sz w:val="24"/>
+        </w:rPr>
+        <w:t>1. Definir papéis entre os membros da equipe e coordenação das atividades:</w:t>
+      </w:r>
+    </w:p>
+    <w:p>
+      <w:pPr>
+        <w:spacing w:after="80"/>
+        <w:ind w:firstLine="709"/>
+        <w:jc w:val="both"/>
+      </w:pPr>
+      <w:r>
+        <w:rPr>
+          <w:rFonts w:ascii="Times New Roman" w:hAnsi="Times New Roman"/>
+          <w:sz w:val="24"/>
+        </w:rPr>
+        <w:t>Realização de brainstorm para definição dos responsáveis por cada atividade do trabalho, conforme Plano de Ação. Devem ser basicamente divididas as seguintes tarefas:</w:t>
+      </w:r>
+    </w:p>
+    <w:p>
+      <w:pPr>
+        <w:spacing w:after="80"/>
+        <w:ind w:firstLine="709"/>
+        <w:jc w:val="both"/>
+      </w:pPr>
+      <w:r>
+        <w:rPr>
+          <w:rFonts w:ascii="Times New Roman" w:hAnsi="Times New Roman"/>
+          <w:sz w:val="24"/>
+        </w:rPr>
+        <w:t>levantamento de requisitos (todos os membros); prototipagem de telas (um membro);</w:t>
+      </w:r>
+    </w:p>
+    <w:p>
+      <w:pPr>
+        <w:spacing w:after="80"/>
+        <w:ind w:firstLine="709"/>
+        <w:jc w:val="both"/>
+      </w:pPr>
+      <w:r>
+        <w:rPr>
+          <w:rFonts w:ascii="Times New Roman" w:hAnsi="Times New Roman"/>
+          <w:sz w:val="24"/>
+        </w:rPr>
+        <w:t>levantamento de dados (um membro); controle de versão (um membro); Banco de Dados</w:t>
+      </w:r>
+    </w:p>
+    <w:p>
+      <w:pPr>
+        <w:spacing w:after="80"/>
+        <w:ind w:firstLine="709"/>
+        <w:jc w:val="both"/>
+      </w:pPr>
+      <w:r>
+        <w:rPr>
+          <w:rFonts w:ascii="Times New Roman" w:hAnsi="Times New Roman"/>
+          <w:sz w:val="24"/>
+        </w:rPr>
+        <w:t>(um membro); interface de mapas (um membro); desenvolvimento de aplicação WEB (2 membros); testes de integração (um membro); teste piloto (todos os membros); coordenação</w:t>
+      </w:r>
+    </w:p>
+    <w:p>
+      <w:pPr>
+        <w:spacing w:after="80"/>
+        <w:ind w:firstLine="709"/>
+        <w:jc w:val="both"/>
+      </w:pPr>
+      <w:r>
+        <w:rPr>
+          <w:rFonts w:ascii="Times New Roman" w:hAnsi="Times New Roman"/>
+          <w:sz w:val="24"/>
+        </w:rPr>
+        <w:t>(um membro).</w:t>
+      </w:r>
+    </w:p>
+    <w:p>
+      <w:pPr>
+        <w:spacing w:after="80"/>
+        <w:ind w:firstLine="709"/>
+        <w:jc w:val="both"/>
+      </w:pPr>
+      <w:r>
+        <w:rPr>
+          <w:rFonts w:ascii="Times New Roman" w:hAnsi="Times New Roman"/>
+          <w:sz w:val="24"/>
+        </w:rPr>
+        <w:t>2. Definir os requisitos da aplicação, definindo-se nesta fase quais as funcionalidades deverão ser implementadas:</w:t>
+      </w:r>
+    </w:p>
+    <w:p>
+      <w:pPr>
+        <w:spacing w:after="80"/>
+        <w:ind w:firstLine="709"/>
+        <w:jc w:val="both"/>
+      </w:pPr>
+      <w:r>
+        <w:rPr>
+          <w:rFonts w:ascii="Times New Roman" w:hAnsi="Times New Roman"/>
+          <w:sz w:val="24"/>
+        </w:rPr>
+        <w:t>Reuniões online de brainstorm entre os membros do grupo, bem como entrevistas informais a colegas de universidade e profissionais interessados em cursas pós-graduação, buscando-</w:t>
+      </w:r>
+    </w:p>
+    <w:p>
+      <w:pPr>
+        <w:spacing w:after="80"/>
+        <w:ind w:firstLine="709"/>
+        <w:jc w:val="both"/>
+      </w:pPr>
+      <w:r>
+        <w:rPr>
+          <w:rFonts w:ascii="Times New Roman" w:hAnsi="Times New Roman"/>
+          <w:sz w:val="24"/>
+        </w:rPr>
+        <w:t>se identificar que tipo de informações seriam relevantes como resultados de eventuais buscas por informações sobre o tema na Internet.</w:t>
+      </w:r>
+    </w:p>
+    <w:p>
+      <w:pPr>
+        <w:spacing w:after="80"/>
+        <w:ind w:firstLine="709"/>
+        <w:jc w:val="both"/>
+      </w:pPr>
+      <w:r>
+        <w:rPr>
+          <w:rFonts w:ascii="Times New Roman" w:hAnsi="Times New Roman"/>
+          <w:sz w:val="24"/>
+        </w:rPr>
+        <w:t>3. Definir as tecnologias a serem usadas para Banco de Dados, interface de mapas e desenvolvimento WEB:</w:t>
+      </w:r>
+    </w:p>
+    <w:p>
+      <w:pPr>
+        <w:spacing w:after="80"/>
+        <w:ind w:firstLine="709"/>
+        <w:jc w:val="both"/>
+      </w:pPr>
+      <w:r>
+        <w:rPr>
+          <w:rFonts w:ascii="Times New Roman" w:hAnsi="Times New Roman"/>
+          <w:sz w:val="24"/>
+        </w:rPr>
+        <w:t>Reuniões online de brainstorm entre os membros do grupo, conteúdos dos cursos COM300 e COM320 e experiências pregressas em desenvolvimento de software pelos membros da</w:t>
+      </w:r>
+    </w:p>
+    <w:p>
+      <w:pPr>
+        <w:spacing w:after="80"/>
+        <w:ind w:firstLine="709"/>
+        <w:jc w:val="both"/>
+      </w:pPr>
+      <w:r>
+        <w:rPr>
+          <w:rFonts w:ascii="Times New Roman" w:hAnsi="Times New Roman"/>
+          <w:sz w:val="24"/>
+        </w:rPr>
+        <w:t>equipe. O conteúdo dos cursos citados deve ser um balizador em relação às tecnologias, particularmente em relação a Banco de Dados e interfaces WEB.</w:t>
+      </w:r>
+    </w:p>
+    <w:p>
+      <w:pPr>
+        <w:spacing w:after="80"/>
+        <w:ind w:firstLine="709"/>
+        <w:jc w:val="both"/>
+      </w:pPr>
+      <w:r>
+        <w:rPr>
+          <w:rFonts w:ascii="Times New Roman" w:hAnsi="Times New Roman"/>
+          <w:sz w:val="24"/>
+        </w:rPr>
+        <w:t>4. Desenvolver o protótipo das telas da aplicação WEB:</w:t>
+      </w:r>
+    </w:p>
+    <w:p>
+      <w:pPr>
+        <w:spacing w:after="80"/>
+        <w:ind w:firstLine="709"/>
+        <w:jc w:val="both"/>
+      </w:pPr>
+      <w:r>
+        <w:rPr>
+          <w:rFonts w:ascii="Times New Roman" w:hAnsi="Times New Roman"/>
+          <w:sz w:val="24"/>
+        </w:rPr>
+        <w:t>O protótipo de telas será resultado direto das funcionalidades definidas no item 2, sendo proposta por um membro do grupo responsável pela sua prototipagem e aprovada em</w:t>
+      </w:r>
+    </w:p>
+    <w:p>
+      <w:pPr>
+        <w:spacing w:after="80"/>
+        <w:ind w:firstLine="709"/>
+        <w:jc w:val="both"/>
+      </w:pPr>
+      <w:r>
+        <w:rPr>
+          <w:rFonts w:ascii="Times New Roman" w:hAnsi="Times New Roman"/>
+          <w:sz w:val="24"/>
+        </w:rPr>
+        <w:t>consulta ao grupo.</w:t>
+      </w:r>
+    </w:p>
+    <w:p>
+      <w:pPr>
+        <w:spacing w:after="80"/>
+        <w:ind w:firstLine="709"/>
+        <w:jc w:val="both"/>
+      </w:pPr>
+      <w:r>
+        <w:rPr>
+          <w:rFonts w:ascii="Times New Roman" w:hAnsi="Times New Roman"/>
+          <w:sz w:val="24"/>
+        </w:rPr>
+        <w:t>5. Levantar dados sobre IESs e cursos de pós-graduação a partir das plataformas públicas do</w:t>
+      </w:r>
+    </w:p>
+    <w:p>
+      <w:pPr>
+        <w:spacing w:after="80"/>
+        <w:ind w:firstLine="709"/>
+        <w:jc w:val="both"/>
+      </w:pPr>
+      <w:r>
+        <w:rPr>
+          <w:rFonts w:ascii="Times New Roman" w:hAnsi="Times New Roman"/>
+          <w:sz w:val="24"/>
+        </w:rPr>
+        <w:t>MEC e Capes:</w:t>
+      </w:r>
+    </w:p>
+    <w:p>
+      <w:pPr>
+        <w:spacing w:after="80"/>
+        <w:ind w:firstLine="709"/>
+        <w:jc w:val="both"/>
+      </w:pPr>
+      <w:r>
+        <w:rPr>
+          <w:rFonts w:ascii="Times New Roman" w:hAnsi="Times New Roman"/>
+          <w:sz w:val="24"/>
+        </w:rPr>
+        <w:t>Realizada por membro da equipe responsável pela pesquisa de dados públicos, especificamente nas plataformas e-MEC e Sucupira (Capes). Deve-se procurar por planilhas</w:t>
+      </w:r>
+    </w:p>
+    <w:p>
+      <w:pPr>
+        <w:spacing w:after="80"/>
+        <w:ind w:firstLine="709"/>
+        <w:jc w:val="both"/>
+      </w:pPr>
+      <w:r>
+        <w:rPr>
+          <w:rFonts w:ascii="Times New Roman" w:hAnsi="Times New Roman"/>
+          <w:sz w:val="24"/>
+        </w:rPr>
+        <w:t>e arquivos CSV que contenham o máximo de informações possível dos cursos, incluindo endereços, para que seja possível o georreferenciamento.</w:t>
+      </w:r>
+    </w:p>
+    <w:p>
+      <w:pPr>
+        <w:spacing w:after="80"/>
+        <w:ind w:firstLine="709"/>
+        <w:jc w:val="both"/>
+      </w:pPr>
+      <w:r>
+        <w:rPr>
+          <w:rFonts w:ascii="Times New Roman" w:hAnsi="Times New Roman"/>
+          <w:sz w:val="24"/>
+        </w:rPr>
+        <w:t>6. Pré-processamento dos dados levantados, com filtragens, junções,inserção de coordenadas geográficas das IESs e preparação para inserção em Banco de Dados:</w:t>
+      </w:r>
+    </w:p>
+    <w:p>
+      <w:pPr>
+        <w:spacing w:after="80"/>
+        <w:ind w:firstLine="709"/>
+        <w:jc w:val="both"/>
+      </w:pPr>
+      <w:r>
+        <w:rPr>
+          <w:rFonts w:ascii="Times New Roman" w:hAnsi="Times New Roman"/>
+          <w:sz w:val="24"/>
+        </w:rPr>
+        <w:t>A junção das planilhas/CSV obtidas no passo anterior devem ser harmonizadas para que contenham campos de natureza similar e possam, assim, serem unificadas. Deve-se utilizar</w:t>
+      </w:r>
+    </w:p>
+    <w:p>
+      <w:pPr>
+        <w:spacing w:after="80"/>
+        <w:ind w:firstLine="709"/>
+        <w:jc w:val="both"/>
+      </w:pPr>
+      <w:r>
+        <w:rPr>
+          <w:rFonts w:ascii="Times New Roman" w:hAnsi="Times New Roman"/>
+          <w:sz w:val="24"/>
+        </w:rPr>
+        <w:t>ferramentas existentes em aplicativos de planilhas, como MS Excel e OpenOffice Calc.</w:t>
+      </w:r>
+    </w:p>
+    <w:p>
+      <w:pPr>
+        <w:spacing w:after="80"/>
+        <w:ind w:firstLine="709"/>
+        <w:jc w:val="both"/>
+      </w:pPr>
+      <w:r>
+        <w:rPr>
+          <w:rFonts w:ascii="Times New Roman" w:hAnsi="Times New Roman"/>
+          <w:sz w:val="24"/>
+        </w:rPr>
+        <w:t>Devem ser removidos dados incompletos ou tratados para que seja mantida homogeneidade entre os linhas de dados. A posição geográfica (latitude e longitude) deve ser incorporada às</w:t>
+      </w:r>
+    </w:p>
+    <w:p>
+      <w:pPr>
+        <w:spacing w:after="80"/>
+        <w:ind w:firstLine="709"/>
+        <w:jc w:val="both"/>
+      </w:pPr>
+      <w:r>
+        <w:rPr>
+          <w:rFonts w:ascii="Times New Roman" w:hAnsi="Times New Roman"/>
+          <w:sz w:val="24"/>
+        </w:rPr>
+        <w:t>planilhas para que possa ser possível o georreferenciamento posterior. Para a execução desta etapa deverá ser desenvolvido software específico em Python para buscar esses dados na</w:t>
+      </w:r>
+    </w:p>
+    <w:p>
+      <w:pPr>
+        <w:spacing w:after="80"/>
+        <w:ind w:firstLine="709"/>
+        <w:jc w:val="both"/>
+      </w:pPr>
+      <w:r>
+        <w:rPr>
+          <w:rFonts w:ascii="Times New Roman" w:hAnsi="Times New Roman"/>
+          <w:sz w:val="24"/>
+        </w:rPr>
+        <w:t>base do Google Maps a partir do endereço ou nome da IES.</w:t>
+      </w:r>
+    </w:p>
+    <w:p>
+      <w:pPr>
+        <w:spacing w:after="80"/>
+        <w:ind w:firstLine="709"/>
+        <w:jc w:val="both"/>
+      </w:pPr>
+      <w:r>
+        <w:rPr>
+          <w:rFonts w:ascii="Times New Roman" w:hAnsi="Times New Roman"/>
+          <w:sz w:val="24"/>
+        </w:rPr>
+        <w:t>7. Definir e implantar ferramenta de controle de versão:</w:t>
+      </w:r>
+    </w:p>
+    <w:p>
+      <w:pPr>
+        <w:spacing w:after="80"/>
+        <w:ind w:firstLine="709"/>
+        <w:jc w:val="both"/>
+      </w:pPr>
+      <w:r>
+        <w:rPr>
+          <w:rFonts w:ascii="Times New Roman" w:hAnsi="Times New Roman"/>
+          <w:sz w:val="24"/>
+        </w:rPr>
+        <w:t>Deve-se criar conta e repositório no GitHub com essa finalidade, bem como fazer-se o upload das versões intermediárias de todos os artefatos do projeto: relatórios, códigos, banco</w:t>
+      </w:r>
+    </w:p>
+    <w:p>
+      <w:pPr>
+        <w:spacing w:after="80"/>
+        <w:ind w:firstLine="709"/>
+        <w:jc w:val="both"/>
+      </w:pPr>
+      <w:r>
+        <w:rPr>
+          <w:rFonts w:ascii="Times New Roman" w:hAnsi="Times New Roman"/>
+          <w:sz w:val="24"/>
+        </w:rPr>
+        <w:t>de dados, planilhas, etc. O controle de versão ficará a carga de um membro da equipe.</w:t>
+      </w:r>
+    </w:p>
+    <w:p>
+      <w:pPr>
+        <w:spacing w:after="80"/>
+        <w:ind w:firstLine="709"/>
+        <w:jc w:val="both"/>
+      </w:pPr>
+      <w:r>
+        <w:rPr>
+          <w:rFonts w:ascii="Times New Roman" w:hAnsi="Times New Roman"/>
+          <w:sz w:val="24"/>
+        </w:rPr>
+        <w:t>8. Modelar o Banco de Dados e populá-lo com os dados preprocessados:</w:t>
+      </w:r>
+    </w:p>
+    <w:p>
+      <w:pPr>
+        <w:spacing w:after="80"/>
+        <w:ind w:firstLine="709"/>
+        <w:jc w:val="both"/>
+      </w:pPr>
+      <w:r>
+        <w:rPr>
+          <w:rFonts w:ascii="Times New Roman" w:hAnsi="Times New Roman"/>
+          <w:sz w:val="24"/>
+        </w:rPr>
+        <w:t>Deve-se utilizar o Banco de Dados MySQL estudado no curso COM300, sendo que a primeira tarefa será a definição do Modelo Entidade- Relacionamentos (MER). O modelo</w:t>
+      </w:r>
+    </w:p>
+    <w:p>
+      <w:pPr>
+        <w:spacing w:after="80"/>
+        <w:ind w:firstLine="709"/>
+        <w:jc w:val="both"/>
+      </w:pPr>
+      <w:r>
+        <w:rPr>
+          <w:rFonts w:ascii="Times New Roman" w:hAnsi="Times New Roman"/>
+          <w:sz w:val="24"/>
+        </w:rPr>
+        <w:t>deve atender os requisitos de normalização, integralidade e coerência dos dados, flexibilidade e escalabilidade e desempenho. Após aprovação do modelo pela equipe e pré-</w:t>
+      </w:r>
+    </w:p>
+    <w:p>
+      <w:pPr>
+        <w:spacing w:after="80"/>
+        <w:ind w:firstLine="709"/>
+        <w:jc w:val="both"/>
+      </w:pPr>
+      <w:r>
+        <w:rPr>
+          <w:rFonts w:ascii="Times New Roman" w:hAnsi="Times New Roman"/>
+          <w:sz w:val="24"/>
+        </w:rPr>
+        <w:t>processamento dos dados levantados, deve-se desenvolver aplicativo em Python para popular o Banco de Dados. Essa atividade será desenvolvida por membro específico da</w:t>
+      </w:r>
+    </w:p>
+    <w:p>
+      <w:pPr>
+        <w:spacing w:after="80"/>
+        <w:ind w:firstLine="709"/>
+        <w:jc w:val="both"/>
+      </w:pPr>
+      <w:r>
+        <w:rPr>
+          <w:rFonts w:ascii="Times New Roman" w:hAnsi="Times New Roman"/>
+          <w:sz w:val="24"/>
+        </w:rPr>
+        <w:t>equipe. Deve incluir etapa de testes de consultas SQL, testes de integralidade dos dados e coerência entre relacionamentos.</w:t>
+      </w:r>
+    </w:p>
+    <w:p>
+      <w:pPr>
+        <w:spacing w:after="80"/>
+        <w:ind w:firstLine="709"/>
+        <w:jc w:val="both"/>
+      </w:pPr>
+      <w:r>
+        <w:rPr>
+          <w:rFonts w:ascii="Times New Roman" w:hAnsi="Times New Roman"/>
+          <w:sz w:val="24"/>
+        </w:rPr>
+        <w:t>9. Desenvolver a interface WEB sua interação com Banco de Dados, através da programação das consultas em SQL: I</w:t>
+      </w:r>
+    </w:p>
+    <w:p>
+      <w:pPr>
+        <w:spacing w:after="80"/>
+        <w:ind w:firstLine="709"/>
+        <w:jc w:val="both"/>
+      </w:pPr>
+      <w:r>
+        <w:rPr>
+          <w:rFonts w:ascii="Times New Roman" w:hAnsi="Times New Roman"/>
+          <w:sz w:val="24"/>
+        </w:rPr>
+        <w:t>Implementar a interface WEB compatível com browsers Google Chrome, Mozilla Firefox e</w:t>
+      </w:r>
+    </w:p>
+    <w:p>
+      <w:pPr>
+        <w:spacing w:after="80"/>
+        <w:ind w:firstLine="709"/>
+        <w:jc w:val="both"/>
+      </w:pPr>
+      <w:r>
+        <w:rPr>
+          <w:rFonts w:ascii="Times New Roman" w:hAnsi="Times New Roman"/>
+          <w:sz w:val="24"/>
+        </w:rPr>
+        <w:t>Microsoft Edge. Deve incluir o desenvolvimento do código de interface com o aplicativo de mapas da aplicação e com o Banco de Dados. A tecnologia a ser usada deve ser Django,</w:t>
+      </w:r>
+    </w:p>
+    <w:p>
+      <w:pPr>
+        <w:spacing w:after="80"/>
+        <w:ind w:firstLine="709"/>
+        <w:jc w:val="both"/>
+      </w:pPr>
+      <w:r>
+        <w:rPr>
+          <w:rFonts w:ascii="Times New Roman" w:hAnsi="Times New Roman"/>
+          <w:sz w:val="24"/>
+        </w:rPr>
+        <w:t>HTML e Java Script. O desenvolvimento deve incluir etapa de testes unitários.</w:t>
+      </w:r>
+    </w:p>
+    <w:p>
+      <w:pPr>
+        <w:spacing w:after="80"/>
+        <w:ind w:firstLine="709"/>
+        <w:jc w:val="both"/>
+      </w:pPr>
+      <w:r>
+        <w:rPr>
+          <w:rFonts w:ascii="Times New Roman" w:hAnsi="Times New Roman"/>
+          <w:sz w:val="24"/>
+        </w:rPr>
+        <w:t>10. Desenvolver a aplicação de visualização em mapas e sua integração com a interface WEB:</w:t>
+      </w:r>
+    </w:p>
+    <w:p>
+      <w:pPr>
+        <w:spacing w:after="80"/>
+        <w:ind w:firstLine="709"/>
+        <w:jc w:val="both"/>
+      </w:pPr>
+      <w:r>
+        <w:rPr>
+          <w:rFonts w:ascii="Times New Roman" w:hAnsi="Times New Roman"/>
+          <w:sz w:val="24"/>
+        </w:rPr>
+        <w:t>Implementar a interface WEB compatível com browsers Google Chrome, Mozilla Firefox e</w:t>
+      </w:r>
+    </w:p>
+    <w:p>
+      <w:pPr>
+        <w:spacing w:after="80"/>
+        <w:ind w:firstLine="709"/>
+        <w:jc w:val="both"/>
+      </w:pPr>
+      <w:r>
+        <w:rPr>
+          <w:rFonts w:ascii="Times New Roman" w:hAnsi="Times New Roman"/>
+          <w:sz w:val="24"/>
+        </w:rPr>
+        <w:t>Microsoft Edge para receber dados da aplicação WEB do item 9 e mostrar sobre mapas. A tecnologia a ser usada deve ser OpenStretMap. O desenvolvimento deve incluir etapa de</w:t>
+      </w:r>
+    </w:p>
+    <w:p>
+      <w:pPr>
+        <w:spacing w:after="80"/>
+        <w:ind w:firstLine="709"/>
+        <w:jc w:val="both"/>
+      </w:pPr>
+      <w:r>
+        <w:rPr>
+          <w:rFonts w:ascii="Times New Roman" w:hAnsi="Times New Roman"/>
+          <w:sz w:val="24"/>
+        </w:rPr>
+        <w:t>testes unitários e de integração com a interface WEB do item 9.</w:t>
+      </w:r>
+    </w:p>
+    <w:p>
+      <w:pPr>
+        <w:spacing w:after="80"/>
+        <w:ind w:firstLine="709"/>
+        <w:jc w:val="both"/>
+      </w:pPr>
+      <w:r>
+        <w:rPr>
+          <w:rFonts w:ascii="Times New Roman" w:hAnsi="Times New Roman"/>
+          <w:sz w:val="24"/>
+        </w:rPr>
+        <w:t>11. Desenvolver filtros de buscas na aplicação WEB:</w:t>
+      </w:r>
+    </w:p>
+    <w:p>
+      <w:pPr>
+        <w:spacing w:after="80"/>
+        <w:ind w:firstLine="709"/>
+        <w:jc w:val="both"/>
+      </w:pPr>
+      <w:r>
+        <w:rPr>
+          <w:rFonts w:ascii="Times New Roman" w:hAnsi="Times New Roman"/>
+          <w:sz w:val="24"/>
+        </w:rPr>
+        <w:t>Devem ser desenvolvidos no âmbito do item 9, implementando-se os filtros que resultem nas pesquisas que atendam os requisitos e funcionalidades definidas no item 2. O</w:t>
+      </w:r>
+    </w:p>
+    <w:p>
+      <w:pPr>
+        <w:spacing w:after="80"/>
+        <w:ind w:firstLine="709"/>
+        <w:jc w:val="both"/>
+      </w:pPr>
+      <w:r>
+        <w:rPr>
+          <w:rFonts w:ascii="Times New Roman" w:hAnsi="Times New Roman"/>
+          <w:sz w:val="24"/>
+        </w:rPr>
+        <w:t>desenvolvimento deve incluir etapa de testes unitários e de integração com a interface WEB.</w:t>
+      </w:r>
+    </w:p>
+    <w:p>
+      <w:pPr>
+        <w:spacing w:after="80"/>
+        <w:ind w:firstLine="709"/>
+        <w:jc w:val="both"/>
+      </w:pPr>
+      <w:r>
+        <w:rPr>
+          <w:rFonts w:ascii="Times New Roman" w:hAnsi="Times New Roman"/>
+          <w:sz w:val="24"/>
+        </w:rPr>
+        <w:t>12. Definir casos de testes da aplicação e protótipos intermediários e realizar correções:</w:t>
+      </w:r>
+    </w:p>
+    <w:p>
+      <w:pPr>
+        <w:spacing w:after="80"/>
+        <w:ind w:firstLine="709"/>
+        <w:jc w:val="both"/>
+      </w:pPr>
+      <w:r>
+        <w:rPr>
+          <w:rFonts w:ascii="Times New Roman" w:hAnsi="Times New Roman"/>
+          <w:sz w:val="24"/>
+        </w:rPr>
+        <w:t>Desenvolver casos de testes do sistema e aplicar em ambiente controlado, fora da internet, em estrutura de servidor local.</w:t>
+      </w:r>
+    </w:p>
+    <w:p>
+      <w:pPr>
+        <w:spacing w:after="80"/>
+        <w:ind w:firstLine="709"/>
+        <w:jc w:val="both"/>
+      </w:pPr>
+      <w:r>
+        <w:rPr>
+          <w:rFonts w:ascii="Times New Roman" w:hAnsi="Times New Roman"/>
+          <w:sz w:val="24"/>
+        </w:rPr>
+        <w:t>13. Instalar o sistema completo em servidor com acesso pela internet:</w:t>
+      </w:r>
+    </w:p>
+    <w:p>
+      <w:pPr>
+        <w:spacing w:after="80"/>
+        <w:ind w:firstLine="709"/>
+        <w:jc w:val="both"/>
+      </w:pPr>
+      <w:r>
+        <w:rPr>
+          <w:rFonts w:ascii="Times New Roman" w:hAnsi="Times New Roman"/>
+          <w:sz w:val="24"/>
+        </w:rPr>
+        <w:t>Instalar em servidor com acesso externo, sendo necessário servidor com IP acessível através de Firewall de operadora, criando-se infraestrutura para teste piloto a partir de acesso pela</w:t>
+      </w:r>
+    </w:p>
+    <w:p>
+      <w:pPr>
+        <w:spacing w:after="80"/>
+        <w:ind w:firstLine="709"/>
+        <w:jc w:val="both"/>
+      </w:pPr>
+      <w:r>
+        <w:rPr>
+          <w:rFonts w:ascii="Times New Roman" w:hAnsi="Times New Roman"/>
+          <w:sz w:val="24"/>
+        </w:rPr>
+        <w:t>Internet.</w:t>
+      </w:r>
+    </w:p>
+    <w:p>
+      <w:pPr>
+        <w:spacing w:after="80"/>
+        <w:ind w:firstLine="709"/>
+        <w:jc w:val="both"/>
+      </w:pPr>
+      <w:r>
+        <w:rPr>
+          <w:rFonts w:ascii="Times New Roman" w:hAnsi="Times New Roman"/>
+          <w:sz w:val="24"/>
+        </w:rPr>
+        <w:t>14. Realizar piloto com público acadêmico e não acadêmico, procedendo-se à avaliação dos resultados e definição de etapas futuras de desenvolvimento e melhorias:</w:t>
+      </w:r>
+    </w:p>
+    <w:p>
+      <w:pPr>
+        <w:spacing w:after="80"/>
+        <w:ind w:firstLine="709"/>
+        <w:jc w:val="both"/>
+      </w:pPr>
+      <w:r>
+        <w:rPr>
+          <w:rFonts w:ascii="Times New Roman" w:hAnsi="Times New Roman"/>
+          <w:sz w:val="24"/>
+        </w:rPr>
+        <w:t>Eleger equipe de testadores entre possíveis usuários reais para avaliação das funcionalidades, com acesso total ao aplicativo pela internet (via celular ou computador).</w:t>
+      </w:r>
+    </w:p>
+    <w:p>
+      <w:pPr>
+        <w:spacing w:after="80"/>
+        <w:ind w:firstLine="709"/>
+        <w:jc w:val="both"/>
+      </w:pPr>
+      <w:r>
+        <w:rPr>
+          <w:rFonts w:ascii="Times New Roman" w:hAnsi="Times New Roman"/>
+          <w:sz w:val="24"/>
+        </w:rPr>
+        <w:t>Registrar erros e oportunidades de melhoria a partir de entrevista com testadores.</w:t>
+      </w:r>
+    </w:p>
+    <w:p>
+      <w:pPr>
+        <w:spacing w:after="80"/>
+        <w:ind w:firstLine="709"/>
+        <w:jc w:val="both"/>
+      </w:pPr>
+      <w:r>
+        <w:rPr>
+          <w:rFonts w:ascii="Times New Roman" w:hAnsi="Times New Roman"/>
+          <w:sz w:val="24"/>
+        </w:rPr>
+        <w:t>A metodologia apresentada possui alinhamento com os princípios do Design Thinking, uma abordagem centrada no ser humano que busca resolver problemas de forma criativa e colaborativa.</w:t>
+      </w:r>
+    </w:p>
+    <w:p>
+      <w:pPr>
+        <w:spacing w:after="80"/>
+        <w:ind w:firstLine="709"/>
+        <w:jc w:val="both"/>
+      </w:pPr>
+      <w:r>
+        <w:rPr>
+          <w:rFonts w:ascii="Times New Roman" w:hAnsi="Times New Roman"/>
+          <w:sz w:val="24"/>
+        </w:rPr>
+        <w:t>O Design Thinking não é um processo estritamente linear, mas sim iterativo, focado em entender as necessidades reais dos usuários antes e durante a construção da solução (BROWN, 2010) .</w:t>
+      </w:r>
+    </w:p>
+    <w:p>
+      <w:pPr>
+        <w:spacing w:after="80"/>
+        <w:ind w:firstLine="709"/>
+        <w:jc w:val="both"/>
+      </w:pPr>
+      <w:r>
+        <w:rPr>
+          <w:rFonts w:ascii="Times New Roman" w:hAnsi="Times New Roman"/>
+          <w:sz w:val="24"/>
+        </w:rPr>
+        <w:t>Os três pilares fundamentais do Design Thinking são: Ouvir (Imersão/Empatia), Criar (Ideação) e</w:t>
+      </w:r>
+    </w:p>
+    <w:p>
+      <w:pPr>
+        <w:spacing w:after="80"/>
+        <w:ind w:firstLine="709"/>
+        <w:jc w:val="both"/>
+      </w:pPr>
+      <w:r>
+        <w:rPr>
+          <w:rFonts w:ascii="Times New Roman" w:hAnsi="Times New Roman"/>
+          <w:sz w:val="24"/>
+        </w:rPr>
+        <w:t>Prototipar (Prototipação e Teste). Esses pilares estão presentes nas etapas de desenvolvimento propostas, da seguinte forma:</w:t>
+      </w:r>
+    </w:p>
+    <w:p>
+      <w:pPr>
+        <w:spacing w:after="80"/>
+        <w:ind w:firstLine="709"/>
+        <w:jc w:val="both"/>
+      </w:pPr>
+      <w:r>
+        <w:rPr>
+          <w:rFonts w:ascii="Times New Roman" w:hAnsi="Times New Roman"/>
+          <w:sz w:val="24"/>
+        </w:rPr>
+        <w:t>   Ouvir (Imersão e Empatia): no Design Thinking, a etapa de "ouvir" tem o objetivo de entender profundamente o usuário final, suas dores, necessidades e o contexto em que estão</w:t>
+      </w:r>
+    </w:p>
+    <w:p>
+      <w:pPr>
+        <w:spacing w:after="80"/>
+        <w:ind w:firstLine="709"/>
+        <w:jc w:val="both"/>
+      </w:pPr>
+      <w:r>
+        <w:rPr>
+          <w:rFonts w:ascii="Times New Roman" w:hAnsi="Times New Roman"/>
+          <w:sz w:val="24"/>
+        </w:rPr>
+        <w:t>inseridos. Ocorrem nas seguintes etapas:</w:t>
+      </w:r>
+    </w:p>
+    <w:p>
+      <w:pPr>
+        <w:spacing w:after="80"/>
+        <w:ind w:firstLine="709"/>
+        <w:jc w:val="both"/>
+      </w:pPr>
+      <w:r>
+        <w:rPr>
+          <w:rFonts w:ascii="Times New Roman" w:hAnsi="Times New Roman"/>
+          <w:sz w:val="24"/>
+        </w:rPr>
+        <w:t> Levantamento de Requisitos (Item 2): A metodologia aplica esse conceito diretamente ao propor "entrevistas informais a colegas de universidade e</w:t>
+      </w:r>
+    </w:p>
+    <w:p>
+      <w:pPr>
+        <w:spacing w:after="80"/>
+        <w:ind w:firstLine="709"/>
+        <w:jc w:val="both"/>
+      </w:pPr>
+      <w:r>
+        <w:rPr>
+          <w:rFonts w:ascii="Times New Roman" w:hAnsi="Times New Roman"/>
+          <w:sz w:val="24"/>
+        </w:rPr>
+        <w:t>profissionais interessados em cursar pós-graduação". Em vez de a equipe assumir o que o sistema deve ter, ela vai a campo escutar o público-alvo para identificar quais</w:t>
+      </w:r>
+    </w:p>
+    <w:p>
+      <w:pPr>
+        <w:spacing w:after="80"/>
+        <w:ind w:firstLine="709"/>
+        <w:jc w:val="both"/>
+      </w:pPr>
+      <w:r>
+        <w:rPr>
+          <w:rFonts w:ascii="Times New Roman" w:hAnsi="Times New Roman"/>
+          <w:sz w:val="24"/>
+        </w:rPr>
+        <w:t>informações são realmente relevantes para eles.</w:t>
+      </w:r>
+    </w:p>
+    <w:p>
+      <w:pPr>
+        <w:spacing w:after="80"/>
+        <w:ind w:firstLine="709"/>
+        <w:jc w:val="both"/>
+      </w:pPr>
+      <w:r>
+        <w:rPr>
+          <w:rFonts w:ascii="Times New Roman" w:hAnsi="Times New Roman"/>
+          <w:sz w:val="24"/>
+        </w:rPr>
+        <w:t> Avaliação Pós-Piloto (Item 14): O ato de ouvir se repete no final do ciclo. Ao realizar um teste piloto com o público acadêmico e não acadêmico, a equipe conduz</w:t>
+      </w:r>
+    </w:p>
+    <w:p>
+      <w:pPr>
+        <w:spacing w:after="80"/>
+        <w:ind w:firstLine="709"/>
+        <w:jc w:val="both"/>
+      </w:pPr>
+      <w:r>
+        <w:rPr>
+          <w:rFonts w:ascii="Times New Roman" w:hAnsi="Times New Roman"/>
+          <w:sz w:val="24"/>
+        </w:rPr>
+        <w:t>novas entrevistas para "registrar erros e oportunidades de melhoria", garantindo que a voz do usuário continue guiando a evolução do projeto.</w:t>
+      </w:r>
+    </w:p>
+    <w:p>
+      <w:pPr>
+        <w:spacing w:after="80"/>
+        <w:ind w:firstLine="709"/>
+        <w:jc w:val="both"/>
+      </w:pPr>
+      <w:r>
+        <w:rPr>
+          <w:rFonts w:ascii="Times New Roman" w:hAnsi="Times New Roman"/>
+          <w:sz w:val="24"/>
+        </w:rPr>
+        <w:t> Criar (Ideação): a fase de "criar" envolve a geração de ideias, onde a equipe multidisciplinar colabora para encontrar as melhores soluções tecnológicas e funcionais para</w:t>
+      </w:r>
+    </w:p>
+    <w:p>
+      <w:pPr>
+        <w:spacing w:after="80"/>
+        <w:ind w:firstLine="709"/>
+        <w:jc w:val="both"/>
+      </w:pPr>
+      <w:r>
+        <w:rPr>
+          <w:rFonts w:ascii="Times New Roman" w:hAnsi="Times New Roman"/>
+          <w:sz w:val="24"/>
+        </w:rPr>
+        <w:t>os problemas identificados na fase anterior. Ocorrem nas seguintes etapas:</w:t>
+      </w:r>
+    </w:p>
+    <w:p>
+      <w:pPr>
+        <w:spacing w:after="80"/>
+        <w:ind w:firstLine="709"/>
+        <w:jc w:val="both"/>
+      </w:pPr>
+      <w:r>
+        <w:rPr>
+          <w:rFonts w:ascii="Times New Roman" w:hAnsi="Times New Roman"/>
+          <w:sz w:val="24"/>
+        </w:rPr>
+        <w:t> Brainstorming e Definições (Itens 1, 2 e 3): A metodologia destaca o uso recorrente de reuniões de brainstorming para definir os papéis da equipe, os requisitos da</w:t>
+      </w:r>
+    </w:p>
+    <w:p>
+      <w:pPr>
+        <w:spacing w:after="80"/>
+        <w:ind w:firstLine="709"/>
+        <w:jc w:val="both"/>
+      </w:pPr>
+      <w:r>
+        <w:rPr>
+          <w:rFonts w:ascii="Times New Roman" w:hAnsi="Times New Roman"/>
+          <w:sz w:val="24"/>
+        </w:rPr>
+        <w:t>aplicação e as tecnologias a serem utilizadas. Essa é uma técnica clássica de ideação no Design Thinking, promovendo a construção coletiva do conhecimento.</w:t>
+      </w:r>
+    </w:p>
+    <w:p>
+      <w:pPr>
+        <w:spacing w:after="80"/>
+        <w:ind w:firstLine="709"/>
+        <w:jc w:val="both"/>
+      </w:pPr>
+      <w:r>
+        <w:rPr>
+          <w:rFonts w:ascii="Times New Roman" w:hAnsi="Times New Roman"/>
+          <w:sz w:val="24"/>
+        </w:rPr>
+        <w:t> Modelagem de Soluções (Itens 6 e 8): A etapa de criação também se estende à arquitetura técnica da solução, como o pré-processamento dos dados (limpeza e</w:t>
+      </w:r>
+    </w:p>
+    <w:p>
+      <w:pPr>
+        <w:spacing w:after="80"/>
+        <w:ind w:firstLine="709"/>
+        <w:jc w:val="both"/>
+      </w:pPr>
+      <w:r>
+        <w:rPr>
+          <w:rFonts w:ascii="Times New Roman" w:hAnsi="Times New Roman"/>
+          <w:sz w:val="24"/>
+        </w:rPr>
+        <w:t>inserção de coordenadas) e a definição do Modelo Entidade-Relacionamento (MER)</w:t>
+      </w:r>
+    </w:p>
+    <w:p>
+      <w:pPr>
+        <w:spacing w:after="80"/>
+        <w:ind w:firstLine="709"/>
+        <w:jc w:val="both"/>
+      </w:pPr>
+      <w:r>
+        <w:rPr>
+          <w:rFonts w:ascii="Times New Roman" w:hAnsi="Times New Roman"/>
+          <w:sz w:val="24"/>
+        </w:rPr>
+        <w:t>do Banco de Dados, estruturando como as ideias geradas ganharão forma lógica.</w:t>
+      </w:r>
+    </w:p>
+    <w:p>
+      <w:pPr>
+        <w:spacing w:after="80"/>
+        <w:ind w:firstLine="709"/>
+        <w:jc w:val="both"/>
+      </w:pPr>
+      <w:r>
+        <w:rPr>
+          <w:rFonts w:ascii="Times New Roman" w:hAnsi="Times New Roman"/>
+          <w:sz w:val="24"/>
+        </w:rPr>
+        <w:t> Prototipar (Prototipação e Teste): é o ato de tirar as ideias do papel de forma rápida para validar hipóteses com os usuários antes de investir recursos massivos na versão final.</w:t>
+      </w:r>
+    </w:p>
+    <w:p>
+      <w:pPr>
+        <w:spacing w:after="80"/>
+        <w:ind w:firstLine="709"/>
+        <w:jc w:val="both"/>
+      </w:pPr>
+      <w:r>
+        <w:rPr>
+          <w:rFonts w:ascii="Times New Roman" w:hAnsi="Times New Roman"/>
+          <w:sz w:val="24"/>
+        </w:rPr>
+        <w:t> Prototipagem de Telas (Item 4): A metodologia prevê explicitamente o desenvolvimento de protótipos das telas da aplicação WEB logo após a definição das</w:t>
+      </w:r>
+    </w:p>
+    <w:p>
+      <w:pPr>
+        <w:spacing w:after="80"/>
+        <w:ind w:firstLine="709"/>
+        <w:jc w:val="both"/>
+      </w:pPr>
+      <w:r>
+        <w:rPr>
+          <w:rFonts w:ascii="Times New Roman" w:hAnsi="Times New Roman"/>
+          <w:sz w:val="24"/>
+        </w:rPr>
+        <w:t>funcionalidades. Isso permite que a equipe (e potencialmente os usuários) visualize a interface e aprove a direção do projeto antes da codificação pesada.</w:t>
+      </w:r>
+    </w:p>
+    <w:p>
+      <w:pPr>
+        <w:spacing w:after="80"/>
+        <w:ind w:firstLine="709"/>
+        <w:jc w:val="both"/>
+      </w:pPr>
+      <w:r>
+        <w:rPr>
+          <w:rFonts w:ascii="Times New Roman" w:hAnsi="Times New Roman"/>
+          <w:sz w:val="24"/>
+        </w:rPr>
+        <w:t> Construção Iterativa e Testes (Itens 9, 10, 11 e 12): O desenvolvimento da interface</w:t>
+      </w:r>
+    </w:p>
+    <w:p>
+      <w:pPr>
+        <w:spacing w:after="80"/>
+        <w:ind w:firstLine="709"/>
+        <w:jc w:val="both"/>
+      </w:pPr>
+      <w:r>
+        <w:rPr>
+          <w:rFonts w:ascii="Times New Roman" w:hAnsi="Times New Roman"/>
+          <w:sz w:val="24"/>
+        </w:rPr>
+        <w:t>WEB, da aplicação de mapas e dos filtros de busca atua como a construção de um</w:t>
+      </w:r>
+    </w:p>
+    <w:p>
+      <w:pPr>
+        <w:spacing w:after="80"/>
+        <w:ind w:firstLine="709"/>
+        <w:jc w:val="both"/>
+      </w:pPr>
+      <w:r>
+        <w:rPr>
+          <w:rFonts w:ascii="Times New Roman" w:hAnsi="Times New Roman"/>
+          <w:sz w:val="24"/>
+        </w:rPr>
+        <w:t>Produto Mínimo Viável (MVP). A inclusão de testes unitários e de casos de teste em ambiente local garante que o protótipo de alta fidelidade funcione corretamente.</w:t>
+      </w:r>
+    </w:p>
+    <w:p>
+      <w:pPr>
+        <w:spacing w:after="80"/>
+        <w:ind w:firstLine="709"/>
+        <w:jc w:val="both"/>
+      </w:pPr>
+      <w:r>
+        <w:rPr>
+          <w:rFonts w:ascii="Times New Roman" w:hAnsi="Times New Roman"/>
+          <w:sz w:val="24"/>
+        </w:rPr>
+        <w:t> Teste Piloto (Itens 13 e 14): O Design Thinking exige que o protótipo seja testado em contexto real. A instalação do sistema em um servidor com acesso pela internet para</w:t>
+      </w:r>
+    </w:p>
+    <w:p>
+      <w:pPr>
+        <w:spacing w:after="80"/>
+        <w:ind w:firstLine="709"/>
+        <w:jc w:val="both"/>
+      </w:pPr>
+      <w:r>
+        <w:rPr>
+          <w:rFonts w:ascii="Times New Roman" w:hAnsi="Times New Roman"/>
+          <w:sz w:val="24"/>
+        </w:rPr>
+        <w:t>a realização do teste piloto com usuários reais é a validação máxima do protótipo, fechando o ciclo e gerando insights para a próxima iteração.</w:t>
       </w:r>
     </w:p>
     <w:p>
@@ -2478,7 +3391,7 @@
         <w:rPr>
           <w:sz w:val="24"/>
         </w:rPr>
-        <w:t>A solução final desenvolvida consiste em uma plataforma web interativa — "Pós-Graduação Brasil" — que integra dados georreferenciados de 576 Instituições de Ensino Superior (IES) e 7.488 cursos de pós-graduação, permitindo a consulta visual por meio de mapa, tabela com filtros e dashboard estatístico. A aplicação foi implementada utilizando Django 5, SQLite, Leaflet.js, Bootstrap 5.3 e Chart.js 4.4, com deploy na plataforma Railway. O código-fonte completo está disponível publicamente no GitHub: https://github.com/narcinev/PI-UNIVESP-GRUPO-11-1S2026.</w:t>
+        <w:t>A solução final consiste na plataforma web "Pós-Graduação Brasil", integrando dados de 576 IES e 7.488 cursos em mapa interativo com filtros, busca por CEP, dashboard e exportação CSV. Implementada em Django 5, Leaflet.js, Bootstrap 5.3 e Chart.js 4.4, com deploy em Railway. Código-fonte: https://github.com/narcinev/PI-UNIVESP-GRUPO-11-1S2026.</w:t>
       </w:r>
     </w:p>
     <w:p>
@@ -2491,7 +3404,7 @@
         <w:rPr>
           <w:sz w:val="24"/>
         </w:rPr>
-        <w:t>Mapa Interativo com Geocodificação: A página principal (Figura 5) apresenta um mapa do Brasil construído com Leaflet.js sobre tiles do OpenStreetMap. Os marcadores são clusterizados para performance, agrupando IES próximas por nível de zoom. O usuário pode filtrar por UF, status jurídico, modalidade de curso e por nome/sigla da IES. A funcionalidade de busca por endereço permite digitar um endereço ou CEP e o mapa se desloca automaticamente até o local, exibindo um círculo com raio configurável (50 a 500 km). As IES dentro do raio são exibidas com distância em km calculada pela Fórmula de Haversine. A alteração do raio atualiza instantaneamente os marcadores, sem nova requisição. A geocodificação utiliza a API gratuita Nominatim (OpenStreetMap).</w:t>
+        <w:t>Mapa Interativo com Geocodificação: A página principal (Figura 5) apresenta mapa do Brasil com tiles do OpenStreetMap. Marcadores clusterizados agrupam IES próximas. Filtros por UF, status jurídico e modalidade. A busca por endereço/CEP utiliza a API Nominatim para geocodificação gratuita, exibindo círculo com raio configurável (50 a 500 km) e distância em km via Fórmula de Haversine. A alteração do raio atualiza os marcadores instantaneamente via CSS, sem nova requisição ao servidor. O modo escuro (dark mode) foi implementado com toggle persistente e filtro CSS nos tiles do mapa, preservando rios e florestas.</w:t>
       </w:r>
     </w:p>
     <w:p>
@@ -2504,7 +3417,7 @@
         <w:rPr>
           <w:sz w:val="24"/>
         </w:rPr>
-        <w:t>Dashboard Estatístico: A página de dashboard (Figura 6) apresenta gráficos interativos com Chart.js: IES por estado (barras), IES por status jurídico (rosca), top 15 áreas de conhecimento e nota média CAPES por estado. A nota média é calculada a partir dos conceitos reais dos cursos (1 a 7), agregados por UF da IES — correção implementada na versão final, que substituiu o dado fixo da versão preliminar. Cartões-resumo exibem os totais de 576 IES, 7.488 cursos, 27 estados cobertos e 3 graus de pós-graduação.</w:t>
+        <w:t>Dashboard Estatístico: A página (Figura 6) exibe gráficos Chart.js: IES por estado, IES por status jurídico, top 15 áreas de conhecimento e nota média CAPES por estado. A nota média é calculada a partir dos conceitos reais dos cursos (1 a 7), corrigindo bug da versão preliminar que usava dado fixo. Cartões-resumo mostram totais de 576 IES, 7.488 cursos e 27 estados cobertos.</w:t>
       </w:r>
     </w:p>
     <w:p>
@@ -2517,7 +3430,7 @@
         <w:rPr>
           <w:sz w:val="24"/>
         </w:rPr>
-        <w:t>Tabela de Consulta com Exportação: A página de consulta (Figura 7) oferece tabela paginada com filtros por UF, status, modalidade, nota mínima CAPES e busca textual. Os resultados podem ser exportados em CSV. Cada IES possui link para página de detalhes com seus cursos de pós-graduação vinculados, exibindo área, grau, conceito CAPES e situação.</w:t>
+        <w:t>Tabela de Consulta: A página (Figura 7) oferece tabela paginada com filtros avançados e exportação CSV. Cada IES possui página de detalhes com seus cursos vinculados.</w:t>
       </w:r>
     </w:p>
     <w:p>
@@ -2530,7 +3443,7 @@
         <w:rPr>
           <w:sz w:val="24"/>
         </w:rPr>
-        <w:t>A arquitetura segue o padrão Model-View-Template do Django, com banco SQLite armazenando as tabelas relacionais. A importação foi feita a partir de CSVs oficiais da CAPES e MEC, com scripts ETL que garantem integridade referencial.</w:t>
+        <w:t>Arquitetura: Padrão Model-View-Template do Django com banco SQLite. Importação via scripts ETL a partir de CSVs oficiais da CAPES e MEC.</w:t>
       </w:r>
     </w:p>
     <w:p>
@@ -2551,7 +3464,7 @@
         <w:rPr>
           <w:sz w:val="24"/>
         </w:rPr>
-        <w:t>O Projeto Integrador teve como objetivo desenvolver uma plataforma web georreferenciada para visualização e pesquisa de programas de pós-graduação no Brasil, integrando informações da CAPES e do MEC. O objetivo foi alcançado: a plataforma "Pós-Graduação Brasil" está funcional, com mapa interativo, filtros, geocodificação, dashboard e exportação CSV.</w:t>
+        <w:t>O Projeto Integrador alcançou seu objetivo: a plataforma "Pós-Graduação Brasil" está funcional, integrando dados da CAPES e MEC em interface unificada com geocodificação, dashboard e exportação CSV.</w:t>
       </w:r>
     </w:p>
     <w:p>
@@ -2564,7 +3477,7 @@
         <w:rPr>
           <w:sz w:val="24"/>
         </w:rPr>
-        <w:t>Retomando os resultados à luz das referências, a plataforma responde ao problema da fragmentação das informações sobre pós-graduação entre os portais e-MEC e Sucupira, oferecendo uma interface unificada e acessível. A funcionalidade de busca por proximidade geográfica — não disponível nas plataformas oficiais — foi apontada como diferencial pelos usuários consultados.</w:t>
+        <w:t>Retomando os resultados à luz das referências, a plataforma responde ao problema da fragmentação das informações entre os portais e-MEC e Sucupira. A busca por proximidade geográfica — funcionalidade não disponível nas plataformas oficiais — foi apontada como diferencial pelos usuários consultados.</w:t>
       </w:r>
     </w:p>
     <w:p>
@@ -2577,7 +3490,7 @@
         <w:rPr>
           <w:sz w:val="24"/>
         </w:rPr>
-        <w:t>As principais contribuições do trabalho são: (a) integração de dados públicos dispersos em base unificada e georreferenciada; (b) busca por proximidade com raio configurável; (c) código aberto em repositório público, permitindo replicação e extensão; (d) aplicação prática integrada de conhecimentos de programação, web e matemática.</w:t>
+        <w:t>Contribuições: (a) integração de dados públicos em base georreferenciada; (b) busca por proximidade com raio configurável; (c) código aberto no GitHub; (d) aplicação integrada de conhecimentos do curso.</w:t>
       </w:r>
     </w:p>
     <w:p>
@@ -2590,7 +3503,7 @@
         <w:rPr>
           <w:sz w:val="24"/>
         </w:rPr>
-        <w:t>Como limitações, a base de dados depende de atualização periódica dos arquivos oficiais; a interface não foi exaustivamente testada em dispositivos móveis; e a geocodificação está sujeita às limitações do OpenStreetMap em regiões menos mapeadas.</w:t>
+        <w:t>Limitações: a base depende de atualização periódica dos arquivos oficiais; a interface não foi exaustivamente testada em dispositivos móveis; a geocodificação está sujeita às limitações do OpenStreetMap.</w:t>
       </w:r>
     </w:p>
     <w:p>
@@ -2603,7 +3516,7 @@
         <w:rPr>
           <w:sz w:val="24"/>
         </w:rPr>
-        <w:t>O balanço entre a solução inicial e a final evidencia a evolução: de um mapa básico com filtros para uma plataforma completa com geocodificação, dashboard estatístico com dados reais de notas CAPES, exportação CSV e deploy em nuvem. As melhorias incorporadas surgiram do feedback da comunidade externa e da aplicação dos conhecimentos das disciplinas cursadas.</w:t>
+        <w:t>O balanço entre solução inicial e final evidencia a evolução de um mapa básico para plataforma completa com dark mode, geocodificação, dashboard com dados reais e deploy em nuvem. As melhorias surgiram do feedback da comunidade e da aplicação dos conhecimentos das disciplinas cursadas.</w:t>
       </w:r>
     </w:p>
     <w:p>
@@ -2622,9 +3535,10 @@
       </w:pPr>
       <w:r>
         <w:rPr>
+          <w:rFonts w:ascii="Times New Roman" w:hAnsi="Times New Roman"/>
           <w:sz w:val="24"/>
         </w:rPr>
-        <w:t>REFERÊNCIAS</w:t>
+        <w:t>BROWN, T. Design Thinking: uma metodologia poderosa para decretar o fim das velhas ideias. Rio de Janeiro: Elsevier, 2010.</w:t>
       </w:r>
     </w:p>
     <w:p>
@@ -2635,32 +3549,7 @@
       </w:pPr>
       <w:r>
         <w:rPr>
-          <w:sz w:val="24"/>
-        </w:rPr>
-        <w:t>BROWN, T. Design Thinking: uma metodologia poderosa para decretar o fim das velhas</w:t>
-      </w:r>
-    </w:p>
-    <w:p>
-      <w:pPr>
-        <w:spacing w:after="80"/>
-        <w:ind w:firstLine="709"/>
-        <w:jc w:val="both"/>
-      </w:pPr>
-      <w:r>
-        <w:rPr>
-          <w:sz w:val="24"/>
-        </w:rPr>
-        <w:t>ideias. Rio de Janeiro: Elsevier, 2010.</w:t>
-      </w:r>
-    </w:p>
-    <w:p>
-      <w:pPr>
-        <w:spacing w:after="80"/>
-        <w:ind w:firstLine="709"/>
-        <w:jc w:val="both"/>
-      </w:pPr>
-      <w:r>
-        <w:rPr>
+          <w:rFonts w:ascii="Times New Roman" w:hAnsi="Times New Roman"/>
           <w:sz w:val="24"/>
         </w:rPr>
         <w:t>CÂMARA, G.; DAVIS, C. Introdução aos Sistemas de Informação Geográfica. São José dos</w:t>
@@ -2674,6 +3563,7 @@
       </w:pPr>
       <w:r>
         <w:rPr>
+          <w:rFonts w:ascii="Times New Roman" w:hAnsi="Times New Roman"/>
           <w:sz w:val="24"/>
         </w:rPr>
         <w:t>Campos: INPE, 2001.</w:t>
@@ -2687,9 +3577,10 @@
       </w:pPr>
       <w:r>
         <w:rPr>
+          <w:rFonts w:ascii="Times New Roman" w:hAnsi="Times New Roman"/>
           <w:sz w:val="24"/>
         </w:rPr>
-        <w:t>CAPELATO, R.; MORELLI, K.; MORELLI, M.; FREIRE, F.; RAMOS, R. Pesquisa de Pósgraduação (Lato Sensu). 3. ed. São Paulo: Instituto Semesp, 2023. Disponível em:</w:t>
+        <w:t>CAPELATO, R.; MORELLI, K.; MORELLI, M.; FREIRE, F.; RAMOS, R. Pesquisa de Pós- graduação (Lato Sensu). 3. ed. São Paulo: Instituto Semesp, 2023. Disponível em:</w:t>
       </w:r>
     </w:p>
     <w:p>
@@ -2700,9 +3591,10 @@
       </w:pPr>
       <w:r>
         <w:rPr>
+          <w:rFonts w:ascii="Times New Roman" w:hAnsi="Times New Roman"/>
           <w:sz w:val="24"/>
         </w:rPr>
-        <w:t>https://www.semesp.org.br/wp-content/uploads/2023/11/pesquisa-pos-graduacao-2023-versaofinal.pdf Acesso em 05 de abril de 2026.</w:t>
+        <w:t>https://www.semesp.org.br/wp-content/uploads/2023/11/pesquisa-pos-graduacao-2023-versao- final.pdf Acesso em 05 de abril de 2026.</w:t>
       </w:r>
     </w:p>
     <w:p>
@@ -2713,9 +3605,10 @@
       </w:pPr>
       <w:r>
         <w:rPr>
+          <w:rFonts w:ascii="Times New Roman" w:hAnsi="Times New Roman"/>
           <w:sz w:val="24"/>
         </w:rPr>
-        <w:t>CARTA CAPITAL, 2025. Busca por pós-graduação cresce 22% no Brasil: veja os cursos mais</w:t>
+        <w:t>CARTA CAPITAL, 2025. Busca por pós-graduação cresce 22% no Brasil: veja os cursos mais procurados em 2025. Disponível em https://www.cartacapital.com.br/do-micro-ao-macro/busca-</w:t>
       </w:r>
     </w:p>
     <w:p>
@@ -2726,9 +3619,10 @@
       </w:pPr>
       <w:r>
         <w:rPr>
+          <w:rFonts w:ascii="Times New Roman" w:hAnsi="Times New Roman"/>
           <w:sz w:val="24"/>
         </w:rPr>
-        <w:t>procurados em 2025. Disponível em https://www.cartacapital.com.br/do-micro-ao-macro/buscapor-pos-graduacao-cresce-22-no-brasil-veja-os-cursos-mais-procurados-em-2025/ Acesso em 05 de</w:t>
+        <w:t>por-pos-graduacao-cresce-22-no-brasil-veja-os-cursos-mais-procurados-em-2025/ Acesso em 05 de abril de 2026.</w:t>
       </w:r>
     </w:p>
     <w:p>
@@ -2739,9 +3633,10 @@
       </w:pPr>
       <w:r>
         <w:rPr>
+          <w:rFonts w:ascii="Times New Roman" w:hAnsi="Times New Roman"/>
           <w:sz w:val="24"/>
         </w:rPr>
-        <w:t>abril de 2026.</w:t>
+        <w:t>CONQUER BUSINESS SCHOOL, 2025. Pós-graduação: quais são os cursos mais buscados na internet em 2025? Disponível em: https://blog.escolaconquer.com.br/pos-graduacoes-mais-</w:t>
       </w:r>
     </w:p>
     <w:p>
@@ -2752,9 +3647,10 @@
       </w:pPr>
       <w:r>
         <w:rPr>
+          <w:rFonts w:ascii="Times New Roman" w:hAnsi="Times New Roman"/>
           <w:sz w:val="24"/>
         </w:rPr>
-        <w:t>CONQUER BUSINESS SCHOOL, 2025. Pós-graduação: quais são os cursos mais buscados na</w:t>
+        <w:t>buscadas/ Acesso em 05 de abril de 2026.</w:t>
       </w:r>
     </w:p>
     <w:p>
@@ -2765,19 +3661,7 @@
       </w:pPr>
       <w:r>
         <w:rPr>
-          <w:sz w:val="24"/>
-        </w:rPr>
-        <w:t>internet em 2025? Disponível em: https://blog.escolaconquer.com.br/pos-graduacoes-maisbuscadas/ Acesso em 05 de abril de 2026.</w:t>
-      </w:r>
-    </w:p>
-    <w:p>
-      <w:pPr>
-        <w:spacing w:after="80"/>
-        <w:ind w:firstLine="709"/>
-        <w:jc w:val="both"/>
-      </w:pPr>
-      <w:r>
-        <w:rPr>
+          <w:rFonts w:ascii="Times New Roman" w:hAnsi="Times New Roman"/>
           <w:sz w:val="24"/>
         </w:rPr>
         <w:t>PRESSMAN, R. S. Engenharia de Software: Uma Abordagem Profissional. 7. ed. Porto Alegre:</w:t>
@@ -2791,6 +3675,7 @@
       </w:pPr>
       <w:r>
         <w:rPr>
+          <w:rFonts w:ascii="Times New Roman" w:hAnsi="Times New Roman"/>
           <w:sz w:val="24"/>
         </w:rPr>
         <w:t>AMGH, 2011.</w:t>
@@ -2804,22 +3689,10 @@
       </w:pPr>
       <w:r>
         <w:rPr>
+          <w:rFonts w:ascii="Times New Roman" w:hAnsi="Times New Roman"/>
           <w:sz w:val="24"/>
         </w:rPr>
-        <w:t>SANTOS, V.; DIAS, P. Panorama das abordagens de integração de dados em sistemas de</w:t>
-      </w:r>
-    </w:p>
-    <w:p>
-      <w:pPr>
-        <w:spacing w:after="80"/>
-        <w:ind w:firstLine="709"/>
-        <w:jc w:val="both"/>
-      </w:pPr>
-      <w:r>
-        <w:rPr>
-          <w:sz w:val="24"/>
-        </w:rPr>
-        <w:t>informação. Revista de Sistemas de Informação, v. 10, n. 2, p. 45-60, 2022.</w:t>
+        <w:t>SANTOS, V.; DIAS, P. Panorama das abordagens de integração de dados em sistemas de informação. Revista de Sistemas de Informação, v. 10, n. 2, p. 45-60, 2022.</w:t>
       </w:r>
     </w:p>
     <w:p>
@@ -2838,7 +3711,7 @@
         <w:rPr>
           <w:sz w:val="24"/>
         </w:rPr>
-        <w:t>Apêndice A — Código-fonte completo disponível em: https://github.com/narcinev/PI-UNIVESP-GRUPO-11-1S2026</w:t>
+        <w:t>Apêndice A — Código-fonte: https://github.com/narcinev/PI-UNIVESP-GRUPO-11-1S2026</w:t>
       </w:r>
     </w:p>
     <w:p>
@@ -2846,7 +3719,7 @@
         <w:rPr>
           <w:sz w:val="24"/>
         </w:rPr>
-        <w:t>Apêndice B — Script de importação de dados (importar_dados.py) constante no repositório.</w:t>
+        <w:t>Apêndice B — Script de importação (importar_dados.py) no repositório.</w:t>
       </w:r>
     </w:p>
     <w:sectPr>
@@ -3222,13 +4095,6 @@
     <w:name w:val="Normal"/>
     <w:qFormat/>
     <w:rsid w:val="00FC693F"/>
-    <w:pPr>
-      <w:spacing w:line="360" w:lineRule="auto"/>
-    </w:pPr>
-    <w:rPr>
-      <w:rFonts w:ascii="Times New Roman" w:hAnsi="Times New Roman"/>
-      <w:sz w:val="24"/>
-    </w:rPr>
   </w:style>
   <w:style w:type="paragraph" w:styleId="Header">
     <w:name w:val="header"/>

</xml_diff>